<commit_message>
Deutsch 11: Kafka – Arbeitsblatt nur Text, Präsentation mit Aufträgen und Diktatkontrolle
Co-Authored-By: Claude Opus 5.5 <noreply@anthropic.com>
Claude-Session: https://claude.ai/code/session_01Kzh1oWiqhC6W8oSNq8mKnj
</commit_message>
<xml_diff>
--- a/Deutsch_11/Kafka_Brief_an_den_Vater/Arbeitsblatt_Kafka_Brief_an_den_Vater.docx
+++ b/Deutsch_11/Kafka_Brief_an_den_Vater/Arbeitsblatt_Kafka_Brief_an_den_Vater.docx
@@ -73,7 +73,7 @@
           </w:tcPr>
           <w:p>
             <w:pPr>
-              <w:spacing w:after="40" w:before="0"/>
+              <w:spacing w:after="0" w:before="0"/>
             </w:pPr>
             <w:r>
               <w:rPr>
@@ -96,31 +96,6 @@
                 <w:szCs w:val="22"/>
               </w:rPr>
               <w:t xml:space="preserve">Kafkas „Furcht“ gründet auf Kommunikationsproblemen.</w:t>
-            </w:r>
-          </w:p>
-          <w:p>
-            <w:pPr>
-              <w:spacing w:after="0" w:before="0"/>
-            </w:pPr>
-            <w:r>
-              <w:rPr>
-                <w:rFonts w:ascii="Calibri" w:cs="Calibri" w:eastAsia="Calibri" w:hAnsi="Calibri"/>
-                <w:b/>
-                <w:bCs/>
-                <w:color w:val="1E2761"/>
-                <w:sz w:val="20"/>
-                <w:szCs w:val="20"/>
-              </w:rPr>
-              <w:t xml:space="preserve">So analysiert man: </w:t>
-            </w:r>
-            <w:r>
-              <w:rPr>
-                <w:rFonts w:ascii="Calibri" w:cs="Calibri" w:eastAsia="Calibri" w:hAnsi="Calibri"/>
-                <w:color w:val="000000"/>
-                <w:sz w:val="20"/>
-                <w:szCs w:val="20"/>
-              </w:rPr>
-              <w:t xml:space="preserve">1 Verstehen (Wer? An wen? Worum?)  →  2 Untersuchen (Handlung · Modell · Wirkung)  →  3 Schreiben (Behauptung → Beleg → Erklärung)</w:t>
             </w:r>
           </w:p>
         </w:tc>
@@ -178,7 +153,7 @@
           <w:sz w:val="19"/>
           <w:szCs w:val="19"/>
         </w:rPr>
-        <w:t xml:space="preserve">   gemeinsam im Unterrichtsgespräch – die Matrix übernimmst du in deinen Hefter</w:t>
+        <w:t xml:space="preserve">   gemeinsam im Unterrichtsgespräch – Matrix in deinen Hefter</w:t>
       </w:r>
     </w:p>
     <w:tbl>
@@ -1497,7 +1472,7 @@
           <w:sz w:val="19"/>
           <w:szCs w:val="19"/>
         </w:rPr>
-        <w:t xml:space="preserve">   allein – Aufgabe 1 auf der Rückseite</w:t>
+        <w:t xml:space="preserve">   allein – Matrix in deinen Hefter</w:t>
       </w:r>
     </w:p>
     <w:tbl>
@@ -2691,2230 +2666,6 @@
                 <w:szCs w:val="17"/>
               </w:rPr>
               <w:t xml:space="preserve">= Gegenstück, Folge</w:t>
-            </w:r>
-          </w:p>
-        </w:tc>
-      </w:tr>
-    </w:tbl>
-    <w:p>
-      <w:pPr>
-        <w:pageBreakBefore/>
-        <w:spacing w:after="20" w:before="0"/>
-      </w:pPr>
-      <w:r>
-        <w:rPr>
-          <w:rFonts w:ascii="Calibri" w:cs="Calibri" w:eastAsia="Calibri" w:hAnsi="Calibri"/>
-          <w:b/>
-          <w:bCs/>
-          <w:color w:val="5B6B8C"/>
-          <w:sz w:val="17"/>
-          <w:szCs w:val="17"/>
-        </w:rPr>
-        <w:t xml:space="preserve">AUFGABE 1 · ALLEIN · CA. 13 MIN.</w:t>
-      </w:r>
-    </w:p>
-    <w:p>
-      <w:pPr>
-        <w:spacing w:after="60" w:before="0"/>
-      </w:pPr>
-      <w:r>
-        <w:rPr>
-          <w:rFonts w:ascii="Cambria" w:cs="Cambria" w:eastAsia="Cambria" w:hAnsi="Cambria"/>
-          <w:b/>
-          <w:bCs/>
-          <w:color w:val="1E2761"/>
-          <w:sz w:val="34"/>
-          <w:szCs w:val="34"/>
-        </w:rPr>
-        <w:t xml:space="preserve">Abschnitt C untersuchen</w:t>
-      </w:r>
-    </w:p>
-    <w:p>
-      <w:pPr>
-        <w:spacing w:after="80" w:before="0"/>
-      </w:pPr>
-      <w:r>
-        <w:rPr>
-          <w:rFonts w:ascii="Calibri" w:cs="Calibri" w:eastAsia="Calibri" w:hAnsi="Calibri"/>
-          <w:color w:val="000000"/>
-          <w:sz w:val="21"/>
-          <w:szCs w:val="21"/>
-        </w:rPr>
-        <w:t xml:space="preserve">Untersuche Abschnitt C so, wie wir Abschnitt A gemeinsam untersucht haben. Fülle die Matrix aus: </w:t>
-      </w:r>
-      <w:r>
-        <w:rPr>
-          <w:rFonts w:ascii="Calibri" w:cs="Calibri" w:eastAsia="Calibri" w:hAnsi="Calibri"/>
-          <w:b/>
-          <w:bCs/>
-          <w:color w:val="000000"/>
-          <w:sz w:val="21"/>
-          <w:szCs w:val="21"/>
-        </w:rPr>
-        <w:t xml:space="preserve">mindestens vier Zeilen</w:t>
-      </w:r>
-      <w:r>
-        <w:rPr>
-          <w:rFonts w:ascii="Calibri" w:cs="Calibri" w:eastAsia="Calibri" w:hAnsi="Calibri"/>
-          <w:color w:val="000000"/>
-          <w:sz w:val="21"/>
-          <w:szCs w:val="21"/>
-        </w:rPr>
-        <w:t xml:space="preserve">, jede mit Zitat und Zeilenangabe.</w:t>
-      </w:r>
-    </w:p>
-    <w:tbl>
-      <w:tblPr>
-        <w:tblW w:type="dxa" w:w="10206"/>
-        <w:tblBorders>
-          <w:top w:val="single" w:color="auto" w:sz="4"/>
-          <w:left w:val="single" w:color="auto" w:sz="4"/>
-          <w:bottom w:val="single" w:color="auto" w:sz="4"/>
-          <w:right w:val="single" w:color="auto" w:sz="4"/>
-          <w:insideH w:val="single" w:color="auto" w:sz="4"/>
-          <w:insideV w:val="single" w:color="auto" w:sz="4"/>
-        </w:tblBorders>
-      </w:tblPr>
-      <w:tblGrid>
-        <w:gridCol w:w="10206"/>
-      </w:tblGrid>
-      <w:tr>
-        <w:trPr>
-          <w:cantSplit/>
-        </w:trPr>
-        <w:tc>
-          <w:tcPr>
-            <w:tcW w:type="dxa" w:w="10206"/>
-            <w:tcBorders>
-              <w:top w:val="none" w:color="FFFFFF" w:sz="0"/>
-              <w:left w:val="none" w:color="FFFFFF" w:sz="0"/>
-              <w:bottom w:val="none" w:color="FFFFFF" w:sz="0"/>
-              <w:right w:val="none" w:color="FFFFFF" w:sz="0"/>
-            </w:tcBorders>
-            <w:shd w:fill="FFF8EC" w:color="auto" w:val="clear"/>
-            <w:tcMar>
-              <w:top w:type="dxa" w:w="100"/>
-              <w:left w:type="dxa" w:w="140"/>
-              <w:bottom w:type="dxa" w:w="100"/>
-              <w:right w:type="dxa" w:w="140"/>
-            </w:tcMar>
-            <w:vAlign w:val="top"/>
-          </w:tcPr>
-          <w:p>
-            <w:pPr>
-              <w:spacing w:after="0" w:before="0"/>
-            </w:pPr>
-            <w:r>
-              <w:rPr>
-                <w:rFonts w:ascii="Calibri" w:cs="Calibri" w:eastAsia="Calibri" w:hAnsi="Calibri"/>
-                <w:b/>
-                <w:bCs/>
-                <w:color w:val="1E2761"/>
-                <w:sz w:val="19"/>
-                <w:szCs w:val="19"/>
-              </w:rPr>
-              <w:t xml:space="preserve">Hilfe, wenn du nicht weiterkommst:  </w:t>
-            </w:r>
-            <w:r>
-              <w:rPr>
-                <w:rFonts w:ascii="Calibri" w:cs="Calibri" w:eastAsia="Calibri" w:hAnsi="Calibri"/>
-                <w:color w:val="000000"/>
-                <w:sz w:val="19"/>
-                <w:szCs w:val="19"/>
-              </w:rPr>
-              <w:t xml:space="preserve">Wie klingen die Fragen des Vaters – und wie sind sie gemeint? (Z. 3–5)  ·  Was sagen Lachen und Gesicht? (Z. 5)  ·  Mit wem spricht der Vater eigentlich? (Z. 9–10)  ·  Was macht der Sohn daraus? (Z. 11–15)</w:t>
-            </w:r>
-          </w:p>
-        </w:tc>
-      </w:tr>
-    </w:tbl>
-    <w:p>
-      <w:pPr>
-        <w:spacing w:after="80" w:before="0"/>
-      </w:pPr>
-      <w:r>
-        <w:rPr>
-          <w:rFonts w:ascii="Calibri" w:cs="Calibri" w:eastAsia="Calibri" w:hAnsi="Calibri"/>
-          <w:color w:val="000000"/>
-          <w:sz w:val="22"/>
-          <w:szCs w:val="22"/>
-        </w:rPr>
-        <w:t xml:space="preserve"/>
-      </w:r>
-    </w:p>
-    <w:tbl>
-      <w:tblPr>
-        <w:tblW w:type="dxa" w:w="10206"/>
-        <w:tblBorders>
-          <w:top w:val="single" w:color="auto" w:sz="4"/>
-          <w:left w:val="single" w:color="auto" w:sz="4"/>
-          <w:bottom w:val="single" w:color="auto" w:sz="4"/>
-          <w:right w:val="single" w:color="auto" w:sz="4"/>
-          <w:insideH w:val="single" w:color="auto" w:sz="4"/>
-          <w:insideV w:val="single" w:color="auto" w:sz="4"/>
-        </w:tblBorders>
-      </w:tblPr>
-      <w:tblGrid>
-        <w:gridCol w:w="900"/>
-        <w:gridCol w:w="3000"/>
-        <w:gridCol w:w="3100"/>
-        <w:gridCol w:w="3206"/>
-      </w:tblGrid>
-      <w:tr>
-        <w:trPr>
-          <w:cantSplit/>
-          <w:trHeight w:val="520" w:hRule="atLeast"/>
-        </w:trPr>
-        <w:tc>
-          <w:tcPr>
-            <w:tcW w:type="dxa" w:w="900"/>
-            <w:tcBorders>
-              <w:top w:val="single" w:color="B9C6E8" w:sz="6"/>
-              <w:left w:val="single" w:color="B9C6E8" w:sz="6"/>
-              <w:bottom w:val="single" w:color="B9C6E8" w:sz="6"/>
-              <w:right w:val="single" w:color="B9C6E8" w:sz="6"/>
-            </w:tcBorders>
-            <w:shd w:fill="1E2761" w:color="auto" w:val="clear"/>
-            <w:tcMar>
-              <w:top w:type="dxa" w:w="50"/>
-              <w:left w:type="dxa" w:w="100"/>
-              <w:bottom w:type="dxa" w:w="50"/>
-              <w:right w:type="dxa" w:w="100"/>
-            </w:tcMar>
-            <w:vAlign w:val="top"/>
-          </w:tcPr>
-          <w:p>
-            <w:pPr>
-              <w:spacing w:after="0" w:before="0"/>
-            </w:pPr>
-            <w:r>
-              <w:rPr>
-                <w:rFonts w:ascii="Calibri" w:cs="Calibri" w:eastAsia="Calibri" w:hAnsi="Calibri"/>
-                <w:b/>
-                <w:bCs/>
-                <w:color w:val="FFFFFF"/>
-                <w:sz w:val="19"/>
-                <w:szCs w:val="19"/>
-              </w:rPr>
-              <w:t xml:space="preserve">Z.</w:t>
-            </w:r>
-          </w:p>
-        </w:tc>
-        <w:tc>
-          <w:tcPr>
-            <w:tcW w:type="dxa" w:w="3000"/>
-            <w:tcBorders>
-              <w:top w:val="single" w:color="B9C6E8" w:sz="6"/>
-              <w:left w:val="single" w:color="B9C6E8" w:sz="6"/>
-              <w:bottom w:val="single" w:color="B9C6E8" w:sz="6"/>
-              <w:right w:val="single" w:color="B9C6E8" w:sz="6"/>
-            </w:tcBorders>
-            <w:shd w:fill="1E2761" w:color="auto" w:val="clear"/>
-            <w:tcMar>
-              <w:top w:type="dxa" w:w="50"/>
-              <w:left w:type="dxa" w:w="100"/>
-              <w:bottom w:type="dxa" w:w="50"/>
-              <w:right w:type="dxa" w:w="100"/>
-            </w:tcMar>
-            <w:vAlign w:val="top"/>
-          </w:tcPr>
-          <w:p>
-            <w:pPr>
-              <w:spacing w:after="0" w:before="0"/>
-            </w:pPr>
-            <w:r>
-              <w:rPr>
-                <w:rFonts w:ascii="Calibri" w:cs="Calibri" w:eastAsia="Calibri" w:hAnsi="Calibri"/>
-                <w:b/>
-                <w:bCs/>
-                <w:color w:val="FFFFFF"/>
-                <w:sz w:val="19"/>
-                <w:szCs w:val="19"/>
-              </w:rPr>
-              <w:t xml:space="preserve">Handlung des Vaters</w:t>
-            </w:r>
-          </w:p>
-          <w:p>
-            <w:pPr>
-              <w:spacing w:after="0" w:before="0"/>
-            </w:pPr>
-            <w:r>
-              <w:rPr>
-                <w:rFonts w:ascii="Calibri" w:cs="Calibri" w:eastAsia="Calibri" w:hAnsi="Calibri"/>
-                <w:color w:val="FFFFFF"/>
-                <w:sz w:val="15"/>
-                <w:szCs w:val="15"/>
-              </w:rPr>
-              <w:t xml:space="preserve">Was tut er? (Zitat)</w:t>
-            </w:r>
-          </w:p>
-        </w:tc>
-        <w:tc>
-          <w:tcPr>
-            <w:tcW w:type="dxa" w:w="3100"/>
-            <w:tcBorders>
-              <w:top w:val="single" w:color="B9C6E8" w:sz="6"/>
-              <w:left w:val="single" w:color="B9C6E8" w:sz="6"/>
-              <w:bottom w:val="single" w:color="B9C6E8" w:sz="6"/>
-              <w:right w:val="single" w:color="B9C6E8" w:sz="6"/>
-            </w:tcBorders>
-            <w:shd w:fill="1E2761" w:color="auto" w:val="clear"/>
-            <w:tcMar>
-              <w:top w:type="dxa" w:w="50"/>
-              <w:left w:type="dxa" w:w="100"/>
-              <w:bottom w:type="dxa" w:w="50"/>
-              <w:right w:type="dxa" w:w="100"/>
-            </w:tcMar>
-            <w:vAlign w:val="top"/>
-          </w:tcPr>
-          <w:p>
-            <w:pPr>
-              <w:spacing w:after="0" w:before="0"/>
-            </w:pPr>
-            <w:r>
-              <w:rPr>
-                <w:rFonts w:ascii="Calibri" w:cs="Calibri" w:eastAsia="Calibri" w:hAnsi="Calibri"/>
-                <w:b/>
-                <w:bCs/>
-                <w:color w:val="FFFFFF"/>
-                <w:sz w:val="19"/>
-                <w:szCs w:val="19"/>
-              </w:rPr>
-              <w:t xml:space="preserve">Modell</w:t>
-            </w:r>
-          </w:p>
-          <w:p>
-            <w:pPr>
-              <w:spacing w:after="0" w:before="0"/>
-            </w:pPr>
-            <w:r>
-              <w:rPr>
-                <w:rFonts w:ascii="Calibri" w:cs="Calibri" w:eastAsia="Calibri" w:hAnsi="Calibri"/>
-                <w:color w:val="FFFFFF"/>
-                <w:sz w:val="15"/>
-                <w:szCs w:val="15"/>
-              </w:rPr>
-              <w:t xml:space="preserve">Seite der Nachricht / Axiom</w:t>
-            </w:r>
-          </w:p>
-        </w:tc>
-        <w:tc>
-          <w:tcPr>
-            <w:tcW w:type="dxa" w:w="3206"/>
-            <w:tcBorders>
-              <w:top w:val="single" w:color="B9C6E8" w:sz="6"/>
-              <w:left w:val="single" w:color="B9C6E8" w:sz="6"/>
-              <w:bottom w:val="single" w:color="B9C6E8" w:sz="6"/>
-              <w:right w:val="single" w:color="B9C6E8" w:sz="6"/>
-            </w:tcBorders>
-            <w:shd w:fill="1E2761" w:color="auto" w:val="clear"/>
-            <w:tcMar>
-              <w:top w:type="dxa" w:w="50"/>
-              <w:left w:type="dxa" w:w="100"/>
-              <w:bottom w:type="dxa" w:w="50"/>
-              <w:right w:type="dxa" w:w="100"/>
-            </w:tcMar>
-            <w:vAlign w:val="top"/>
-          </w:tcPr>
-          <w:p>
-            <w:pPr>
-              <w:spacing w:after="0" w:before="0"/>
-            </w:pPr>
-            <w:r>
-              <w:rPr>
-                <w:rFonts w:ascii="Calibri" w:cs="Calibri" w:eastAsia="Calibri" w:hAnsi="Calibri"/>
-                <w:b/>
-                <w:bCs/>
-                <w:color w:val="FFFFFF"/>
-                <w:sz w:val="19"/>
-                <w:szCs w:val="19"/>
-              </w:rPr>
-              <w:t xml:space="preserve">Wirkung auf den Sohn</w:t>
-            </w:r>
-          </w:p>
-          <w:p>
-            <w:pPr>
-              <w:spacing w:after="0" w:before="0"/>
-            </w:pPr>
-            <w:r>
-              <w:rPr>
-                <w:rFonts w:ascii="Calibri" w:cs="Calibri" w:eastAsia="Calibri" w:hAnsi="Calibri"/>
-                <w:color w:val="FFFFFF"/>
-                <w:sz w:val="15"/>
-                <w:szCs w:val="15"/>
-              </w:rPr>
-              <w:t xml:space="preserve">Zitat + Zeile</w:t>
-            </w:r>
-          </w:p>
-        </w:tc>
-      </w:tr>
-      <w:tr>
-        <w:trPr>
-          <w:cantSplit/>
-          <w:trHeight w:val="1250" w:hRule="atLeast"/>
-        </w:trPr>
-        <w:tc>
-          <w:tcPr>
-            <w:tcW w:type="dxa" w:w="900"/>
-            <w:tcBorders>
-              <w:top w:val="single" w:color="B9C6E8" w:sz="6"/>
-              <w:left w:val="single" w:color="B9C6E8" w:sz="6"/>
-              <w:bottom w:val="single" w:color="B9C6E8" w:sz="6"/>
-              <w:right w:val="single" w:color="B9C6E8" w:sz="6"/>
-            </w:tcBorders>
-            <w:tcMar>
-              <w:top w:type="dxa" w:w="50"/>
-              <w:left w:type="dxa" w:w="100"/>
-              <w:bottom w:type="dxa" w:w="50"/>
-              <w:right w:type="dxa" w:w="100"/>
-            </w:tcMar>
-            <w:vAlign w:val="top"/>
-          </w:tcPr>
-          <w:p>
-            <w:pPr>
-              <w:spacing w:after="100" w:before="0"/>
-            </w:pPr>
-            <w:r>
-              <w:rPr>
-                <w:rFonts w:ascii="Calibri" w:cs="Calibri" w:eastAsia="Calibri" w:hAnsi="Calibri"/>
-                <w:color w:val="000000"/>
-                <w:sz w:val="22"/>
-                <w:szCs w:val="22"/>
-              </w:rPr>
-              <w:t xml:space="preserve"/>
-            </w:r>
-          </w:p>
-        </w:tc>
-        <w:tc>
-          <w:tcPr>
-            <w:tcW w:type="dxa" w:w="3000"/>
-            <w:tcBorders>
-              <w:top w:val="single" w:color="B9C6E8" w:sz="6"/>
-              <w:left w:val="single" w:color="B9C6E8" w:sz="6"/>
-              <w:bottom w:val="single" w:color="B9C6E8" w:sz="6"/>
-              <w:right w:val="single" w:color="B9C6E8" w:sz="6"/>
-            </w:tcBorders>
-            <w:tcMar>
-              <w:top w:type="dxa" w:w="50"/>
-              <w:left w:type="dxa" w:w="100"/>
-              <w:bottom w:type="dxa" w:w="50"/>
-              <w:right w:type="dxa" w:w="100"/>
-            </w:tcMar>
-            <w:vAlign w:val="top"/>
-          </w:tcPr>
-          <w:p>
-            <w:pPr>
-              <w:spacing w:after="100" w:before="0"/>
-            </w:pPr>
-            <w:r>
-              <w:rPr>
-                <w:rFonts w:ascii="Calibri" w:cs="Calibri" w:eastAsia="Calibri" w:hAnsi="Calibri"/>
-                <w:color w:val="000000"/>
-                <w:sz w:val="22"/>
-                <w:szCs w:val="22"/>
-              </w:rPr>
-              <w:t xml:space="preserve"/>
-            </w:r>
-          </w:p>
-        </w:tc>
-        <w:tc>
-          <w:tcPr>
-            <w:tcW w:type="dxa" w:w="3100"/>
-            <w:tcBorders>
-              <w:top w:val="single" w:color="B9C6E8" w:sz="6"/>
-              <w:left w:val="single" w:color="B9C6E8" w:sz="6"/>
-              <w:bottom w:val="single" w:color="B9C6E8" w:sz="6"/>
-              <w:right w:val="single" w:color="B9C6E8" w:sz="6"/>
-            </w:tcBorders>
-            <w:tcMar>
-              <w:top w:type="dxa" w:w="50"/>
-              <w:left w:type="dxa" w:w="100"/>
-              <w:bottom w:type="dxa" w:w="50"/>
-              <w:right w:type="dxa" w:w="100"/>
-            </w:tcMar>
-            <w:vAlign w:val="top"/>
-          </w:tcPr>
-          <w:p>
-            <w:pPr>
-              <w:spacing w:after="100" w:before="0"/>
-            </w:pPr>
-            <w:r>
-              <w:rPr>
-                <w:rFonts w:ascii="Calibri" w:cs="Calibri" w:eastAsia="Calibri" w:hAnsi="Calibri"/>
-                <w:color w:val="000000"/>
-                <w:sz w:val="22"/>
-                <w:szCs w:val="22"/>
-              </w:rPr>
-              <w:t xml:space="preserve"/>
-            </w:r>
-          </w:p>
-        </w:tc>
-        <w:tc>
-          <w:tcPr>
-            <w:tcW w:type="dxa" w:w="3206"/>
-            <w:tcBorders>
-              <w:top w:val="single" w:color="B9C6E8" w:sz="6"/>
-              <w:left w:val="single" w:color="B9C6E8" w:sz="6"/>
-              <w:bottom w:val="single" w:color="B9C6E8" w:sz="6"/>
-              <w:right w:val="single" w:color="B9C6E8" w:sz="6"/>
-            </w:tcBorders>
-            <w:tcMar>
-              <w:top w:type="dxa" w:w="50"/>
-              <w:left w:type="dxa" w:w="100"/>
-              <w:bottom w:type="dxa" w:w="50"/>
-              <w:right w:type="dxa" w:w="100"/>
-            </w:tcMar>
-            <w:vAlign w:val="top"/>
-          </w:tcPr>
-          <w:p>
-            <w:pPr>
-              <w:spacing w:after="100" w:before="0"/>
-            </w:pPr>
-            <w:r>
-              <w:rPr>
-                <w:rFonts w:ascii="Calibri" w:cs="Calibri" w:eastAsia="Calibri" w:hAnsi="Calibri"/>
-                <w:color w:val="000000"/>
-                <w:sz w:val="22"/>
-                <w:szCs w:val="22"/>
-              </w:rPr>
-              <w:t xml:space="preserve"/>
-            </w:r>
-          </w:p>
-        </w:tc>
-      </w:tr>
-      <w:tr>
-        <w:trPr>
-          <w:cantSplit/>
-          <w:trHeight w:val="1250" w:hRule="atLeast"/>
-        </w:trPr>
-        <w:tc>
-          <w:tcPr>
-            <w:tcW w:type="dxa" w:w="900"/>
-            <w:tcBorders>
-              <w:top w:val="single" w:color="B9C6E8" w:sz="6"/>
-              <w:left w:val="single" w:color="B9C6E8" w:sz="6"/>
-              <w:bottom w:val="single" w:color="B9C6E8" w:sz="6"/>
-              <w:right w:val="single" w:color="B9C6E8" w:sz="6"/>
-            </w:tcBorders>
-            <w:tcMar>
-              <w:top w:type="dxa" w:w="50"/>
-              <w:left w:type="dxa" w:w="100"/>
-              <w:bottom w:type="dxa" w:w="50"/>
-              <w:right w:type="dxa" w:w="100"/>
-            </w:tcMar>
-            <w:vAlign w:val="top"/>
-          </w:tcPr>
-          <w:p>
-            <w:pPr>
-              <w:spacing w:after="100" w:before="0"/>
-            </w:pPr>
-            <w:r>
-              <w:rPr>
-                <w:rFonts w:ascii="Calibri" w:cs="Calibri" w:eastAsia="Calibri" w:hAnsi="Calibri"/>
-                <w:color w:val="000000"/>
-                <w:sz w:val="22"/>
-                <w:szCs w:val="22"/>
-              </w:rPr>
-              <w:t xml:space="preserve"/>
-            </w:r>
-          </w:p>
-        </w:tc>
-        <w:tc>
-          <w:tcPr>
-            <w:tcW w:type="dxa" w:w="3000"/>
-            <w:tcBorders>
-              <w:top w:val="single" w:color="B9C6E8" w:sz="6"/>
-              <w:left w:val="single" w:color="B9C6E8" w:sz="6"/>
-              <w:bottom w:val="single" w:color="B9C6E8" w:sz="6"/>
-              <w:right w:val="single" w:color="B9C6E8" w:sz="6"/>
-            </w:tcBorders>
-            <w:tcMar>
-              <w:top w:type="dxa" w:w="50"/>
-              <w:left w:type="dxa" w:w="100"/>
-              <w:bottom w:type="dxa" w:w="50"/>
-              <w:right w:type="dxa" w:w="100"/>
-            </w:tcMar>
-            <w:vAlign w:val="top"/>
-          </w:tcPr>
-          <w:p>
-            <w:pPr>
-              <w:spacing w:after="100" w:before="0"/>
-            </w:pPr>
-            <w:r>
-              <w:rPr>
-                <w:rFonts w:ascii="Calibri" w:cs="Calibri" w:eastAsia="Calibri" w:hAnsi="Calibri"/>
-                <w:color w:val="000000"/>
-                <w:sz w:val="22"/>
-                <w:szCs w:val="22"/>
-              </w:rPr>
-              <w:t xml:space="preserve"/>
-            </w:r>
-          </w:p>
-        </w:tc>
-        <w:tc>
-          <w:tcPr>
-            <w:tcW w:type="dxa" w:w="3100"/>
-            <w:tcBorders>
-              <w:top w:val="single" w:color="B9C6E8" w:sz="6"/>
-              <w:left w:val="single" w:color="B9C6E8" w:sz="6"/>
-              <w:bottom w:val="single" w:color="B9C6E8" w:sz="6"/>
-              <w:right w:val="single" w:color="B9C6E8" w:sz="6"/>
-            </w:tcBorders>
-            <w:tcMar>
-              <w:top w:type="dxa" w:w="50"/>
-              <w:left w:type="dxa" w:w="100"/>
-              <w:bottom w:type="dxa" w:w="50"/>
-              <w:right w:type="dxa" w:w="100"/>
-            </w:tcMar>
-            <w:vAlign w:val="top"/>
-          </w:tcPr>
-          <w:p>
-            <w:pPr>
-              <w:spacing w:after="100" w:before="0"/>
-            </w:pPr>
-            <w:r>
-              <w:rPr>
-                <w:rFonts w:ascii="Calibri" w:cs="Calibri" w:eastAsia="Calibri" w:hAnsi="Calibri"/>
-                <w:color w:val="000000"/>
-                <w:sz w:val="22"/>
-                <w:szCs w:val="22"/>
-              </w:rPr>
-              <w:t xml:space="preserve"/>
-            </w:r>
-          </w:p>
-        </w:tc>
-        <w:tc>
-          <w:tcPr>
-            <w:tcW w:type="dxa" w:w="3206"/>
-            <w:tcBorders>
-              <w:top w:val="single" w:color="B9C6E8" w:sz="6"/>
-              <w:left w:val="single" w:color="B9C6E8" w:sz="6"/>
-              <w:bottom w:val="single" w:color="B9C6E8" w:sz="6"/>
-              <w:right w:val="single" w:color="B9C6E8" w:sz="6"/>
-            </w:tcBorders>
-            <w:tcMar>
-              <w:top w:type="dxa" w:w="50"/>
-              <w:left w:type="dxa" w:w="100"/>
-              <w:bottom w:type="dxa" w:w="50"/>
-              <w:right w:type="dxa" w:w="100"/>
-            </w:tcMar>
-            <w:vAlign w:val="top"/>
-          </w:tcPr>
-          <w:p>
-            <w:pPr>
-              <w:spacing w:after="100" w:before="0"/>
-            </w:pPr>
-            <w:r>
-              <w:rPr>
-                <w:rFonts w:ascii="Calibri" w:cs="Calibri" w:eastAsia="Calibri" w:hAnsi="Calibri"/>
-                <w:color w:val="000000"/>
-                <w:sz w:val="22"/>
-                <w:szCs w:val="22"/>
-              </w:rPr>
-              <w:t xml:space="preserve"/>
-            </w:r>
-          </w:p>
-        </w:tc>
-      </w:tr>
-      <w:tr>
-        <w:trPr>
-          <w:cantSplit/>
-          <w:trHeight w:val="1250" w:hRule="atLeast"/>
-        </w:trPr>
-        <w:tc>
-          <w:tcPr>
-            <w:tcW w:type="dxa" w:w="900"/>
-            <w:tcBorders>
-              <w:top w:val="single" w:color="B9C6E8" w:sz="6"/>
-              <w:left w:val="single" w:color="B9C6E8" w:sz="6"/>
-              <w:bottom w:val="single" w:color="B9C6E8" w:sz="6"/>
-              <w:right w:val="single" w:color="B9C6E8" w:sz="6"/>
-            </w:tcBorders>
-            <w:tcMar>
-              <w:top w:type="dxa" w:w="50"/>
-              <w:left w:type="dxa" w:w="100"/>
-              <w:bottom w:type="dxa" w:w="50"/>
-              <w:right w:type="dxa" w:w="100"/>
-            </w:tcMar>
-            <w:vAlign w:val="top"/>
-          </w:tcPr>
-          <w:p>
-            <w:pPr>
-              <w:spacing w:after="100" w:before="0"/>
-            </w:pPr>
-            <w:r>
-              <w:rPr>
-                <w:rFonts w:ascii="Calibri" w:cs="Calibri" w:eastAsia="Calibri" w:hAnsi="Calibri"/>
-                <w:color w:val="000000"/>
-                <w:sz w:val="22"/>
-                <w:szCs w:val="22"/>
-              </w:rPr>
-              <w:t xml:space="preserve"/>
-            </w:r>
-          </w:p>
-        </w:tc>
-        <w:tc>
-          <w:tcPr>
-            <w:tcW w:type="dxa" w:w="3000"/>
-            <w:tcBorders>
-              <w:top w:val="single" w:color="B9C6E8" w:sz="6"/>
-              <w:left w:val="single" w:color="B9C6E8" w:sz="6"/>
-              <w:bottom w:val="single" w:color="B9C6E8" w:sz="6"/>
-              <w:right w:val="single" w:color="B9C6E8" w:sz="6"/>
-            </w:tcBorders>
-            <w:tcMar>
-              <w:top w:type="dxa" w:w="50"/>
-              <w:left w:type="dxa" w:w="100"/>
-              <w:bottom w:type="dxa" w:w="50"/>
-              <w:right w:type="dxa" w:w="100"/>
-            </w:tcMar>
-            <w:vAlign w:val="top"/>
-          </w:tcPr>
-          <w:p>
-            <w:pPr>
-              <w:spacing w:after="100" w:before="0"/>
-            </w:pPr>
-            <w:r>
-              <w:rPr>
-                <w:rFonts w:ascii="Calibri" w:cs="Calibri" w:eastAsia="Calibri" w:hAnsi="Calibri"/>
-                <w:color w:val="000000"/>
-                <w:sz w:val="22"/>
-                <w:szCs w:val="22"/>
-              </w:rPr>
-              <w:t xml:space="preserve"/>
-            </w:r>
-          </w:p>
-        </w:tc>
-        <w:tc>
-          <w:tcPr>
-            <w:tcW w:type="dxa" w:w="3100"/>
-            <w:tcBorders>
-              <w:top w:val="single" w:color="B9C6E8" w:sz="6"/>
-              <w:left w:val="single" w:color="B9C6E8" w:sz="6"/>
-              <w:bottom w:val="single" w:color="B9C6E8" w:sz="6"/>
-              <w:right w:val="single" w:color="B9C6E8" w:sz="6"/>
-            </w:tcBorders>
-            <w:tcMar>
-              <w:top w:type="dxa" w:w="50"/>
-              <w:left w:type="dxa" w:w="100"/>
-              <w:bottom w:type="dxa" w:w="50"/>
-              <w:right w:type="dxa" w:w="100"/>
-            </w:tcMar>
-            <w:vAlign w:val="top"/>
-          </w:tcPr>
-          <w:p>
-            <w:pPr>
-              <w:spacing w:after="100" w:before="0"/>
-            </w:pPr>
-            <w:r>
-              <w:rPr>
-                <w:rFonts w:ascii="Calibri" w:cs="Calibri" w:eastAsia="Calibri" w:hAnsi="Calibri"/>
-                <w:color w:val="000000"/>
-                <w:sz w:val="22"/>
-                <w:szCs w:val="22"/>
-              </w:rPr>
-              <w:t xml:space="preserve"/>
-            </w:r>
-          </w:p>
-        </w:tc>
-        <w:tc>
-          <w:tcPr>
-            <w:tcW w:type="dxa" w:w="3206"/>
-            <w:tcBorders>
-              <w:top w:val="single" w:color="B9C6E8" w:sz="6"/>
-              <w:left w:val="single" w:color="B9C6E8" w:sz="6"/>
-              <w:bottom w:val="single" w:color="B9C6E8" w:sz="6"/>
-              <w:right w:val="single" w:color="B9C6E8" w:sz="6"/>
-            </w:tcBorders>
-            <w:tcMar>
-              <w:top w:type="dxa" w:w="50"/>
-              <w:left w:type="dxa" w:w="100"/>
-              <w:bottom w:type="dxa" w:w="50"/>
-              <w:right w:type="dxa" w:w="100"/>
-            </w:tcMar>
-            <w:vAlign w:val="top"/>
-          </w:tcPr>
-          <w:p>
-            <w:pPr>
-              <w:spacing w:after="100" w:before="0"/>
-            </w:pPr>
-            <w:r>
-              <w:rPr>
-                <w:rFonts w:ascii="Calibri" w:cs="Calibri" w:eastAsia="Calibri" w:hAnsi="Calibri"/>
-                <w:color w:val="000000"/>
-                <w:sz w:val="22"/>
-                <w:szCs w:val="22"/>
-              </w:rPr>
-              <w:t xml:space="preserve"/>
-            </w:r>
-          </w:p>
-        </w:tc>
-      </w:tr>
-      <w:tr>
-        <w:trPr>
-          <w:cantSplit/>
-          <w:trHeight w:val="1250" w:hRule="atLeast"/>
-        </w:trPr>
-        <w:tc>
-          <w:tcPr>
-            <w:tcW w:type="dxa" w:w="900"/>
-            <w:tcBorders>
-              <w:top w:val="single" w:color="B9C6E8" w:sz="6"/>
-              <w:left w:val="single" w:color="B9C6E8" w:sz="6"/>
-              <w:bottom w:val="single" w:color="B9C6E8" w:sz="6"/>
-              <w:right w:val="single" w:color="B9C6E8" w:sz="6"/>
-            </w:tcBorders>
-            <w:tcMar>
-              <w:top w:type="dxa" w:w="50"/>
-              <w:left w:type="dxa" w:w="100"/>
-              <w:bottom w:type="dxa" w:w="50"/>
-              <w:right w:type="dxa" w:w="100"/>
-            </w:tcMar>
-            <w:vAlign w:val="top"/>
-          </w:tcPr>
-          <w:p>
-            <w:pPr>
-              <w:spacing w:after="100" w:before="0"/>
-            </w:pPr>
-            <w:r>
-              <w:rPr>
-                <w:rFonts w:ascii="Calibri" w:cs="Calibri" w:eastAsia="Calibri" w:hAnsi="Calibri"/>
-                <w:color w:val="000000"/>
-                <w:sz w:val="22"/>
-                <w:szCs w:val="22"/>
-              </w:rPr>
-              <w:t xml:space="preserve"/>
-            </w:r>
-          </w:p>
-        </w:tc>
-        <w:tc>
-          <w:tcPr>
-            <w:tcW w:type="dxa" w:w="3000"/>
-            <w:tcBorders>
-              <w:top w:val="single" w:color="B9C6E8" w:sz="6"/>
-              <w:left w:val="single" w:color="B9C6E8" w:sz="6"/>
-              <w:bottom w:val="single" w:color="B9C6E8" w:sz="6"/>
-              <w:right w:val="single" w:color="B9C6E8" w:sz="6"/>
-            </w:tcBorders>
-            <w:tcMar>
-              <w:top w:type="dxa" w:w="50"/>
-              <w:left w:type="dxa" w:w="100"/>
-              <w:bottom w:type="dxa" w:w="50"/>
-              <w:right w:type="dxa" w:w="100"/>
-            </w:tcMar>
-            <w:vAlign w:val="top"/>
-          </w:tcPr>
-          <w:p>
-            <w:pPr>
-              <w:spacing w:after="100" w:before="0"/>
-            </w:pPr>
-            <w:r>
-              <w:rPr>
-                <w:rFonts w:ascii="Calibri" w:cs="Calibri" w:eastAsia="Calibri" w:hAnsi="Calibri"/>
-                <w:color w:val="000000"/>
-                <w:sz w:val="22"/>
-                <w:szCs w:val="22"/>
-              </w:rPr>
-              <w:t xml:space="preserve"/>
-            </w:r>
-          </w:p>
-        </w:tc>
-        <w:tc>
-          <w:tcPr>
-            <w:tcW w:type="dxa" w:w="3100"/>
-            <w:tcBorders>
-              <w:top w:val="single" w:color="B9C6E8" w:sz="6"/>
-              <w:left w:val="single" w:color="B9C6E8" w:sz="6"/>
-              <w:bottom w:val="single" w:color="B9C6E8" w:sz="6"/>
-              <w:right w:val="single" w:color="B9C6E8" w:sz="6"/>
-            </w:tcBorders>
-            <w:tcMar>
-              <w:top w:type="dxa" w:w="50"/>
-              <w:left w:type="dxa" w:w="100"/>
-              <w:bottom w:type="dxa" w:w="50"/>
-              <w:right w:type="dxa" w:w="100"/>
-            </w:tcMar>
-            <w:vAlign w:val="top"/>
-          </w:tcPr>
-          <w:p>
-            <w:pPr>
-              <w:spacing w:after="100" w:before="0"/>
-            </w:pPr>
-            <w:r>
-              <w:rPr>
-                <w:rFonts w:ascii="Calibri" w:cs="Calibri" w:eastAsia="Calibri" w:hAnsi="Calibri"/>
-                <w:color w:val="000000"/>
-                <w:sz w:val="22"/>
-                <w:szCs w:val="22"/>
-              </w:rPr>
-              <w:t xml:space="preserve"/>
-            </w:r>
-          </w:p>
-        </w:tc>
-        <w:tc>
-          <w:tcPr>
-            <w:tcW w:type="dxa" w:w="3206"/>
-            <w:tcBorders>
-              <w:top w:val="single" w:color="B9C6E8" w:sz="6"/>
-              <w:left w:val="single" w:color="B9C6E8" w:sz="6"/>
-              <w:bottom w:val="single" w:color="B9C6E8" w:sz="6"/>
-              <w:right w:val="single" w:color="B9C6E8" w:sz="6"/>
-            </w:tcBorders>
-            <w:tcMar>
-              <w:top w:type="dxa" w:w="50"/>
-              <w:left w:type="dxa" w:w="100"/>
-              <w:bottom w:type="dxa" w:w="50"/>
-              <w:right w:type="dxa" w:w="100"/>
-            </w:tcMar>
-            <w:vAlign w:val="top"/>
-          </w:tcPr>
-          <w:p>
-            <w:pPr>
-              <w:spacing w:after="100" w:before="0"/>
-            </w:pPr>
-            <w:r>
-              <w:rPr>
-                <w:rFonts w:ascii="Calibri" w:cs="Calibri" w:eastAsia="Calibri" w:hAnsi="Calibri"/>
-                <w:color w:val="000000"/>
-                <w:sz w:val="22"/>
-                <w:szCs w:val="22"/>
-              </w:rPr>
-              <w:t xml:space="preserve"/>
-            </w:r>
-          </w:p>
-        </w:tc>
-      </w:tr>
-      <w:tr>
-        <w:trPr>
-          <w:cantSplit/>
-          <w:trHeight w:val="1250" w:hRule="atLeast"/>
-        </w:trPr>
-        <w:tc>
-          <w:tcPr>
-            <w:tcW w:type="dxa" w:w="900"/>
-            <w:tcBorders>
-              <w:top w:val="single" w:color="B9C6E8" w:sz="6"/>
-              <w:left w:val="single" w:color="B9C6E8" w:sz="6"/>
-              <w:bottom w:val="single" w:color="B9C6E8" w:sz="6"/>
-              <w:right w:val="single" w:color="B9C6E8" w:sz="6"/>
-            </w:tcBorders>
-            <w:tcMar>
-              <w:top w:type="dxa" w:w="50"/>
-              <w:left w:type="dxa" w:w="100"/>
-              <w:bottom w:type="dxa" w:w="50"/>
-              <w:right w:type="dxa" w:w="100"/>
-            </w:tcMar>
-            <w:vAlign w:val="top"/>
-          </w:tcPr>
-          <w:p>
-            <w:pPr>
-              <w:spacing w:after="100" w:before="0"/>
-            </w:pPr>
-            <w:r>
-              <w:rPr>
-                <w:rFonts w:ascii="Calibri" w:cs="Calibri" w:eastAsia="Calibri" w:hAnsi="Calibri"/>
-                <w:color w:val="000000"/>
-                <w:sz w:val="22"/>
-                <w:szCs w:val="22"/>
-              </w:rPr>
-              <w:t xml:space="preserve"/>
-            </w:r>
-          </w:p>
-        </w:tc>
-        <w:tc>
-          <w:tcPr>
-            <w:tcW w:type="dxa" w:w="3000"/>
-            <w:tcBorders>
-              <w:top w:val="single" w:color="B9C6E8" w:sz="6"/>
-              <w:left w:val="single" w:color="B9C6E8" w:sz="6"/>
-              <w:bottom w:val="single" w:color="B9C6E8" w:sz="6"/>
-              <w:right w:val="single" w:color="B9C6E8" w:sz="6"/>
-            </w:tcBorders>
-            <w:tcMar>
-              <w:top w:type="dxa" w:w="50"/>
-              <w:left w:type="dxa" w:w="100"/>
-              <w:bottom w:type="dxa" w:w="50"/>
-              <w:right w:type="dxa" w:w="100"/>
-            </w:tcMar>
-            <w:vAlign w:val="top"/>
-          </w:tcPr>
-          <w:p>
-            <w:pPr>
-              <w:spacing w:after="100" w:before="0"/>
-            </w:pPr>
-            <w:r>
-              <w:rPr>
-                <w:rFonts w:ascii="Calibri" w:cs="Calibri" w:eastAsia="Calibri" w:hAnsi="Calibri"/>
-                <w:color w:val="000000"/>
-                <w:sz w:val="22"/>
-                <w:szCs w:val="22"/>
-              </w:rPr>
-              <w:t xml:space="preserve"/>
-            </w:r>
-          </w:p>
-        </w:tc>
-        <w:tc>
-          <w:tcPr>
-            <w:tcW w:type="dxa" w:w="3100"/>
-            <w:tcBorders>
-              <w:top w:val="single" w:color="B9C6E8" w:sz="6"/>
-              <w:left w:val="single" w:color="B9C6E8" w:sz="6"/>
-              <w:bottom w:val="single" w:color="B9C6E8" w:sz="6"/>
-              <w:right w:val="single" w:color="B9C6E8" w:sz="6"/>
-            </w:tcBorders>
-            <w:tcMar>
-              <w:top w:type="dxa" w:w="50"/>
-              <w:left w:type="dxa" w:w="100"/>
-              <w:bottom w:type="dxa" w:w="50"/>
-              <w:right w:type="dxa" w:w="100"/>
-            </w:tcMar>
-            <w:vAlign w:val="top"/>
-          </w:tcPr>
-          <w:p>
-            <w:pPr>
-              <w:spacing w:after="100" w:before="0"/>
-            </w:pPr>
-            <w:r>
-              <w:rPr>
-                <w:rFonts w:ascii="Calibri" w:cs="Calibri" w:eastAsia="Calibri" w:hAnsi="Calibri"/>
-                <w:color w:val="000000"/>
-                <w:sz w:val="22"/>
-                <w:szCs w:val="22"/>
-              </w:rPr>
-              <w:t xml:space="preserve"/>
-            </w:r>
-          </w:p>
-        </w:tc>
-        <w:tc>
-          <w:tcPr>
-            <w:tcW w:type="dxa" w:w="3206"/>
-            <w:tcBorders>
-              <w:top w:val="single" w:color="B9C6E8" w:sz="6"/>
-              <w:left w:val="single" w:color="B9C6E8" w:sz="6"/>
-              <w:bottom w:val="single" w:color="B9C6E8" w:sz="6"/>
-              <w:right w:val="single" w:color="B9C6E8" w:sz="6"/>
-            </w:tcBorders>
-            <w:tcMar>
-              <w:top w:type="dxa" w:w="50"/>
-              <w:left w:type="dxa" w:w="100"/>
-              <w:bottom w:type="dxa" w:w="50"/>
-              <w:right w:type="dxa" w:w="100"/>
-            </w:tcMar>
-            <w:vAlign w:val="top"/>
-          </w:tcPr>
-          <w:p>
-            <w:pPr>
-              <w:spacing w:after="100" w:before="0"/>
-            </w:pPr>
-            <w:r>
-              <w:rPr>
-                <w:rFonts w:ascii="Calibri" w:cs="Calibri" w:eastAsia="Calibri" w:hAnsi="Calibri"/>
-                <w:color w:val="000000"/>
-                <w:sz w:val="22"/>
-                <w:szCs w:val="22"/>
-              </w:rPr>
-              <w:t xml:space="preserve"/>
-            </w:r>
-          </w:p>
-        </w:tc>
-      </w:tr>
-    </w:tbl>
-    <w:p>
-      <w:pPr>
-        <w:spacing w:after="0" w:before="80"/>
-      </w:pPr>
-      <w:r>
-        <w:rPr>
-          <w:rFonts w:ascii="Calibri" w:cs="Calibri" w:eastAsia="Calibri" w:hAnsi="Calibri"/>
-          <w:b/>
-          <w:bCs/>
-          <w:color w:val="1E2761"/>
-          <w:sz w:val="18"/>
-          <w:szCs w:val="18"/>
-        </w:rPr>
-        <w:t xml:space="preserve">Zitieren: </w:t>
-      </w:r>
-      <w:r>
-        <w:rPr>
-          <w:rFonts w:ascii="Calibri" w:cs="Calibri" w:eastAsia="Calibri" w:hAnsi="Calibri"/>
-          <w:i/>
-          <w:iCs/>
-          <w:color w:val="5B6B8C"/>
-          <w:sz w:val="18"/>
-          <w:szCs w:val="18"/>
-        </w:rPr>
-        <w:t xml:space="preserve">„Das ist Dir wohl schon zu viel?“ (Z. 3 f.)  ·  ein Wort angepasst: die „erhobene[n] Hand“  ·  ausgelassen: „schon bestraft, ehe man noch wußte […]“</w:t>
-      </w:r>
-    </w:p>
-    <w:p>
-      <w:pPr>
-        <w:pageBreakBefore/>
-        <w:spacing w:after="20" w:before="0"/>
-      </w:pPr>
-      <w:r>
-        <w:rPr>
-          <w:rFonts w:ascii="Calibri" w:cs="Calibri" w:eastAsia="Calibri" w:hAnsi="Calibri"/>
-          <w:b/>
-          <w:bCs/>
-          <w:color w:val="5B6B8C"/>
-          <w:sz w:val="17"/>
-          <w:szCs w:val="17"/>
-        </w:rPr>
-        <w:t xml:space="preserve">AUFGABE 2 · ALLEIN · CA. 15 MIN.</w:t>
-      </w:r>
-    </w:p>
-    <w:p>
-      <w:pPr>
-        <w:spacing w:after="60" w:before="0"/>
-      </w:pPr>
-      <w:r>
-        <w:rPr>
-          <w:rFonts w:ascii="Cambria" w:cs="Cambria" w:eastAsia="Cambria" w:hAnsi="Cambria"/>
-          <w:b/>
-          <w:bCs/>
-          <w:color w:val="1E2761"/>
-          <w:sz w:val="34"/>
-          <w:szCs w:val="34"/>
-        </w:rPr>
-        <w:t xml:space="preserve">Vom Tafelbild zum Fließtext</w:t>
-      </w:r>
-    </w:p>
-    <w:p>
-      <w:pPr>
-        <w:spacing w:after="80" w:before="0"/>
-      </w:pPr>
-      <w:r>
-        <w:rPr>
-          <w:rFonts w:ascii="Calibri" w:cs="Calibri" w:eastAsia="Calibri" w:hAnsi="Calibri"/>
-          <w:color w:val="000000"/>
-          <w:sz w:val="21"/>
-          <w:szCs w:val="21"/>
-        </w:rPr>
-        <w:t xml:space="preserve">Überführe die Matrix von der Tafel (A und C) in einen </w:t>
-      </w:r>
-      <w:r>
-        <w:rPr>
-          <w:rFonts w:ascii="Calibri" w:cs="Calibri" w:eastAsia="Calibri" w:hAnsi="Calibri"/>
-          <w:b/>
-          <w:bCs/>
-          <w:color w:val="000000"/>
-          <w:sz w:val="21"/>
-          <w:szCs w:val="21"/>
-        </w:rPr>
-        <w:t xml:space="preserve">zusammenhängenden Text</w:t>
-      </w:r>
-      <w:r>
-        <w:rPr>
-          <w:rFonts w:ascii="Calibri" w:cs="Calibri" w:eastAsia="Calibri" w:hAnsi="Calibri"/>
-          <w:color w:val="000000"/>
-          <w:sz w:val="21"/>
-          <w:szCs w:val="21"/>
-        </w:rPr>
-        <w:t xml:space="preserve">. Schreibe so, wie du es in der Klausur tun würdest.</w:t>
-      </w:r>
-    </w:p>
-    <w:tbl>
-      <w:tblPr>
-        <w:tblW w:type="dxa" w:w="10206"/>
-        <w:tblBorders>
-          <w:top w:val="single" w:color="auto" w:sz="4"/>
-          <w:left w:val="single" w:color="auto" w:sz="4"/>
-          <w:bottom w:val="single" w:color="auto" w:sz="4"/>
-          <w:right w:val="single" w:color="auto" w:sz="4"/>
-          <w:insideH w:val="single" w:color="auto" w:sz="4"/>
-          <w:insideV w:val="single" w:color="auto" w:sz="4"/>
-        </w:tblBorders>
-      </w:tblPr>
-      <w:tblGrid>
-        <w:gridCol w:w="3100"/>
-        <w:gridCol w:w="7106"/>
-      </w:tblGrid>
-      <w:tr>
-        <w:trPr>
-          <w:cantSplit/>
-          <w:trHeight w:val="380" w:hRule="atLeast"/>
-        </w:trPr>
-        <w:tc>
-          <w:tcPr>
-            <w:tcW w:type="dxa" w:w="3100"/>
-            <w:tcBorders>
-              <w:top w:val="single" w:color="B9C6E8" w:sz="6"/>
-              <w:left w:val="single" w:color="B9C6E8" w:sz="6"/>
-              <w:bottom w:val="single" w:color="B9C6E8" w:sz="6"/>
-              <w:right w:val="single" w:color="B9C6E8" w:sz="6"/>
-            </w:tcBorders>
-            <w:shd w:fill="F4F7FD" w:color="auto" w:val="clear"/>
-            <w:tcMar>
-              <w:top w:type="dxa" w:w="50"/>
-              <w:left w:type="dxa" w:w="100"/>
-              <w:bottom w:type="dxa" w:w="50"/>
-              <w:right w:type="dxa" w:w="100"/>
-            </w:tcMar>
-            <w:vAlign w:val="top"/>
-          </w:tcPr>
-          <w:p>
-            <w:pPr>
-              <w:spacing w:after="0" w:before="0"/>
-            </w:pPr>
-            <w:r>
-              <w:rPr>
-                <w:rFonts w:ascii="Calibri" w:cs="Calibri" w:eastAsia="Calibri" w:hAnsi="Calibri"/>
-                <w:b/>
-                <w:bCs/>
-                <w:color w:val="1E2761"/>
-                <w:sz w:val="20"/>
-                <w:szCs w:val="20"/>
-              </w:rPr>
-              <w:t xml:space="preserve">Einleitung</w:t>
-            </w:r>
-          </w:p>
-        </w:tc>
-        <w:tc>
-          <w:tcPr>
-            <w:tcW w:type="dxa" w:w="7106"/>
-            <w:tcBorders>
-              <w:top w:val="single" w:color="B9C6E8" w:sz="6"/>
-              <w:left w:val="single" w:color="B9C6E8" w:sz="6"/>
-              <w:bottom w:val="single" w:color="B9C6E8" w:sz="6"/>
-              <w:right w:val="single" w:color="B9C6E8" w:sz="6"/>
-            </w:tcBorders>
-            <w:tcMar>
-              <w:top w:type="dxa" w:w="50"/>
-              <w:left w:type="dxa" w:w="100"/>
-              <w:bottom w:type="dxa" w:w="50"/>
-              <w:right w:type="dxa" w:w="100"/>
-            </w:tcMar>
-            <w:vAlign w:val="top"/>
-          </w:tcPr>
-          <w:p>
-            <w:pPr>
-              <w:spacing w:after="0" w:before="0"/>
-            </w:pPr>
-            <w:r>
-              <w:rPr>
-                <w:rFonts w:ascii="Calibri" w:cs="Calibri" w:eastAsia="Calibri" w:hAnsi="Calibri"/>
-                <w:color w:val="000000"/>
-                <w:sz w:val="19"/>
-                <w:szCs w:val="19"/>
-              </w:rPr>
-              <w:t xml:space="preserve">Wer schreibt an wen, wann, worüber? Worum geht es in den beiden Abschnitten?</w:t>
-            </w:r>
-          </w:p>
-        </w:tc>
-      </w:tr>
-      <w:tr>
-        <w:trPr>
-          <w:cantSplit/>
-          <w:trHeight w:val="380" w:hRule="atLeast"/>
-        </w:trPr>
-        <w:tc>
-          <w:tcPr>
-            <w:tcW w:type="dxa" w:w="3100"/>
-            <w:tcBorders>
-              <w:top w:val="single" w:color="B9C6E8" w:sz="6"/>
-              <w:left w:val="single" w:color="B9C6E8" w:sz="6"/>
-              <w:bottom w:val="single" w:color="B9C6E8" w:sz="6"/>
-              <w:right w:val="single" w:color="B9C6E8" w:sz="6"/>
-            </w:tcBorders>
-            <w:shd w:fill="F4F7FD" w:color="auto" w:val="clear"/>
-            <w:tcMar>
-              <w:top w:type="dxa" w:w="50"/>
-              <w:left w:type="dxa" w:w="100"/>
-              <w:bottom w:type="dxa" w:w="50"/>
-              <w:right w:type="dxa" w:w="100"/>
-            </w:tcMar>
-            <w:vAlign w:val="top"/>
-          </w:tcPr>
-          <w:p>
-            <w:pPr>
-              <w:spacing w:after="0" w:before="0"/>
-            </w:pPr>
-            <w:r>
-              <w:rPr>
-                <w:rFonts w:ascii="Calibri" w:cs="Calibri" w:eastAsia="Calibri" w:hAnsi="Calibri"/>
-                <w:b/>
-                <w:bCs/>
-                <w:color w:val="1E2761"/>
-                <w:sz w:val="20"/>
-                <w:szCs w:val="20"/>
-              </w:rPr>
-              <w:t xml:space="preserve">Hauptteil</w:t>
-            </w:r>
-          </w:p>
-        </w:tc>
-        <w:tc>
-          <w:tcPr>
-            <w:tcW w:type="dxa" w:w="7106"/>
-            <w:tcBorders>
-              <w:top w:val="single" w:color="B9C6E8" w:sz="6"/>
-              <w:left w:val="single" w:color="B9C6E8" w:sz="6"/>
-              <w:bottom w:val="single" w:color="B9C6E8" w:sz="6"/>
-              <w:right w:val="single" w:color="B9C6E8" w:sz="6"/>
-            </w:tcBorders>
-            <w:tcMar>
-              <w:top w:type="dxa" w:w="50"/>
-              <w:left w:type="dxa" w:w="100"/>
-              <w:bottom w:type="dxa" w:w="50"/>
-              <w:right w:type="dxa" w:w="100"/>
-            </w:tcMar>
-            <w:vAlign w:val="top"/>
-          </w:tcPr>
-          <w:p>
-            <w:pPr>
-              <w:spacing w:after="0" w:before="0"/>
-            </w:pPr>
-            <w:r>
-              <w:rPr>
-                <w:rFonts w:ascii="Calibri" w:cs="Calibri" w:eastAsia="Calibri" w:hAnsi="Calibri"/>
-                <w:color w:val="000000"/>
-                <w:sz w:val="19"/>
-                <w:szCs w:val="19"/>
-              </w:rPr>
-              <w:t xml:space="preserve">Je Zeile der Matrix: Behauptung → Beleg (Zitat + Z.) → Erklärung mit Fachbegriff. Erst A, dann C.</w:t>
-            </w:r>
-          </w:p>
-        </w:tc>
-      </w:tr>
-      <w:tr>
-        <w:trPr>
-          <w:cantSplit/>
-          <w:trHeight w:val="380" w:hRule="atLeast"/>
-        </w:trPr>
-        <w:tc>
-          <w:tcPr>
-            <w:tcW w:type="dxa" w:w="3100"/>
-            <w:tcBorders>
-              <w:top w:val="single" w:color="B9C6E8" w:sz="6"/>
-              <w:left w:val="single" w:color="B9C6E8" w:sz="6"/>
-              <w:bottom w:val="single" w:color="B9C6E8" w:sz="6"/>
-              <w:right w:val="single" w:color="B9C6E8" w:sz="6"/>
-            </w:tcBorders>
-            <w:shd w:fill="F4F7FD" w:color="auto" w:val="clear"/>
-            <w:tcMar>
-              <w:top w:type="dxa" w:w="50"/>
-              <w:left w:type="dxa" w:w="100"/>
-              <w:bottom w:type="dxa" w:w="50"/>
-              <w:right w:type="dxa" w:w="100"/>
-            </w:tcMar>
-            <w:vAlign w:val="top"/>
-          </w:tcPr>
-          <w:p>
-            <w:pPr>
-              <w:spacing w:after="0" w:before="0"/>
-            </w:pPr>
-            <w:r>
-              <w:rPr>
-                <w:rFonts w:ascii="Calibri" w:cs="Calibri" w:eastAsia="Calibri" w:hAnsi="Calibri"/>
-                <w:b/>
-                <w:bCs/>
-                <w:color w:val="1E2761"/>
-                <w:sz w:val="20"/>
-                <w:szCs w:val="20"/>
-              </w:rPr>
-              <w:t xml:space="preserve">Schluss</w:t>
-            </w:r>
-          </w:p>
-        </w:tc>
-        <w:tc>
-          <w:tcPr>
-            <w:tcW w:type="dxa" w:w="7106"/>
-            <w:tcBorders>
-              <w:top w:val="single" w:color="B9C6E8" w:sz="6"/>
-              <w:left w:val="single" w:color="B9C6E8" w:sz="6"/>
-              <w:bottom w:val="single" w:color="B9C6E8" w:sz="6"/>
-              <w:right w:val="single" w:color="B9C6E8" w:sz="6"/>
-            </w:tcBorders>
-            <w:tcMar>
-              <w:top w:type="dxa" w:w="50"/>
-              <w:left w:type="dxa" w:w="100"/>
-              <w:bottom w:type="dxa" w:w="50"/>
-              <w:right w:type="dxa" w:w="100"/>
-            </w:tcMar>
-            <w:vAlign w:val="top"/>
-          </w:tcPr>
-          <w:p>
-            <w:pPr>
-              <w:spacing w:after="0" w:before="0"/>
-            </w:pPr>
-            <w:r>
-              <w:rPr>
-                <w:rFonts w:ascii="Calibri" w:cs="Calibri" w:eastAsia="Calibri" w:hAnsi="Calibri"/>
-                <w:color w:val="000000"/>
-                <w:sz w:val="19"/>
-                <w:szCs w:val="19"/>
-              </w:rPr>
-              <w:t xml:space="preserve">Stützen die Stellen die These? Was muss man ergänzen?</w:t>
-            </w:r>
-          </w:p>
-        </w:tc>
-      </w:tr>
-    </w:tbl>
-    <w:p>
-      <w:pPr>
-        <w:spacing w:after="60" w:before="0"/>
-      </w:pPr>
-      <w:r>
-        <w:rPr>
-          <w:rFonts w:ascii="Calibri" w:cs="Calibri" w:eastAsia="Calibri" w:hAnsi="Calibri"/>
-          <w:color w:val="000000"/>
-          <w:sz w:val="22"/>
-          <w:szCs w:val="22"/>
-        </w:rPr>
-        <w:t xml:space="preserve"/>
-      </w:r>
-    </w:p>
-    <w:tbl>
-      <w:tblPr>
-        <w:tblW w:type="dxa" w:w="10206"/>
-        <w:tblBorders>
-          <w:top w:val="single" w:color="auto" w:sz="4"/>
-          <w:left w:val="single" w:color="auto" w:sz="4"/>
-          <w:bottom w:val="single" w:color="auto" w:sz="4"/>
-          <w:right w:val="single" w:color="auto" w:sz="4"/>
-          <w:insideH w:val="single" w:color="auto" w:sz="4"/>
-          <w:insideV w:val="single" w:color="auto" w:sz="4"/>
-        </w:tblBorders>
-      </w:tblPr>
-      <w:tblGrid>
-        <w:gridCol w:w="10206"/>
-      </w:tblGrid>
-      <w:tr>
-        <w:trPr>
-          <w:cantSplit/>
-        </w:trPr>
-        <w:tc>
-          <w:tcPr>
-            <w:tcW w:type="dxa" w:w="10206"/>
-            <w:tcBorders>
-              <w:top w:val="none" w:color="FFFFFF" w:sz="0"/>
-              <w:left w:val="none" w:color="FFFFFF" w:sz="0"/>
-              <w:bottom w:val="none" w:color="FFFFFF" w:sz="0"/>
-              <w:right w:val="none" w:color="FFFFFF" w:sz="0"/>
-            </w:tcBorders>
-            <w:shd w:fill="FFF8EC" w:color="auto" w:val="clear"/>
-            <w:tcMar>
-              <w:top w:type="dxa" w:w="100"/>
-              <w:left w:type="dxa" w:w="140"/>
-              <w:bottom w:type="dxa" w:w="100"/>
-              <w:right w:type="dxa" w:w="140"/>
-            </w:tcMar>
-            <w:vAlign w:val="top"/>
-          </w:tcPr>
-          <w:p>
-            <w:pPr>
-              <w:spacing w:after="0" w:before="0"/>
-            </w:pPr>
-            <w:r>
-              <w:rPr>
-                <w:rFonts w:ascii="Calibri" w:cs="Calibri" w:eastAsia="Calibri" w:hAnsi="Calibri"/>
-                <w:b/>
-                <w:bCs/>
-                <w:color w:val="1E2761"/>
-                <w:sz w:val="19"/>
-                <w:szCs w:val="19"/>
-              </w:rPr>
-              <w:t xml:space="preserve">Satzbausteine:  </w:t>
-            </w:r>
-            <w:r>
-              <w:rPr>
-                <w:rFonts w:ascii="Calibri" w:cs="Calibri" w:eastAsia="Calibri" w:hAnsi="Calibri"/>
-                <w:i/>
-                <w:iCs/>
-                <w:color w:val="000000"/>
-                <w:sz w:val="19"/>
-                <w:szCs w:val="19"/>
-              </w:rPr>
-              <w:t xml:space="preserve">In seinem „Brief an den Vater“ (1919) …  ·  Indem der Vater …, sendet er …  ·  Dies zeigt sich in … (Z. …)  ·  Hinzu kommt, dass …  ·  Die Folge ist …  ·  Besonders deutlich wird dies, wenn …  ·  Insgesamt stützt die Stelle die These, weil …  ·  Allerdings …</w:t>
-            </w:r>
-          </w:p>
-        </w:tc>
-      </w:tr>
-    </w:tbl>
-    <w:p>
-      <w:pPr>
-        <w:spacing w:after="80" w:before="0"/>
-      </w:pPr>
-      <w:r>
-        <w:rPr>
-          <w:rFonts w:ascii="Calibri" w:cs="Calibri" w:eastAsia="Calibri" w:hAnsi="Calibri"/>
-          <w:color w:val="000000"/>
-          <w:sz w:val="22"/>
-          <w:szCs w:val="22"/>
-        </w:rPr>
-        <w:t xml:space="preserve"/>
-      </w:r>
-    </w:p>
-    <w:tbl>
-      <w:tblPr>
-        <w:tblW w:type="dxa" w:w="10206"/>
-        <w:tblBorders>
-          <w:top w:val="single" w:color="auto" w:sz="4"/>
-          <w:left w:val="single" w:color="auto" w:sz="4"/>
-          <w:bottom w:val="single" w:color="auto" w:sz="4"/>
-          <w:right w:val="single" w:color="auto" w:sz="4"/>
-          <w:insideH w:val="single" w:color="auto" w:sz="4"/>
-          <w:insideV w:val="single" w:color="auto" w:sz="4"/>
-        </w:tblBorders>
-      </w:tblPr>
-      <w:tblGrid>
-        <w:gridCol w:w="10206"/>
-      </w:tblGrid>
-      <w:tr>
-        <w:trPr>
-          <w:cantSplit/>
-          <w:trHeight w:val="470" w:hRule="atLeast"/>
-        </w:trPr>
-        <w:tc>
-          <w:tcPr>
-            <w:tcW w:type="dxa" w:w="10206"/>
-            <w:tcBorders>
-              <w:top w:val="none" w:color="FFFFFF" w:sz="0"/>
-              <w:left w:val="none" w:color="FFFFFF" w:sz="0"/>
-              <w:bottom w:val="single" w:color="9AA6C4" w:sz="6"/>
-              <w:right w:val="none" w:color="FFFFFF" w:sz="0"/>
-            </w:tcBorders>
-            <w:tcMar>
-              <w:top w:type="dxa" w:w="50"/>
-              <w:left w:type="dxa" w:w="100"/>
-              <w:bottom w:type="dxa" w:w="50"/>
-              <w:right w:type="dxa" w:w="100"/>
-            </w:tcMar>
-            <w:vAlign w:val="top"/>
-          </w:tcPr>
-          <w:p>
-            <w:pPr>
-              <w:spacing w:after="100" w:before="0"/>
-            </w:pPr>
-            <w:r>
-              <w:rPr>
-                <w:rFonts w:ascii="Calibri" w:cs="Calibri" w:eastAsia="Calibri" w:hAnsi="Calibri"/>
-                <w:color w:val="000000"/>
-                <w:sz w:val="22"/>
-                <w:szCs w:val="22"/>
-              </w:rPr>
-              <w:t xml:space="preserve"/>
-            </w:r>
-          </w:p>
-        </w:tc>
-      </w:tr>
-      <w:tr>
-        <w:trPr>
-          <w:cantSplit/>
-          <w:trHeight w:val="470" w:hRule="atLeast"/>
-        </w:trPr>
-        <w:tc>
-          <w:tcPr>
-            <w:tcW w:type="dxa" w:w="10206"/>
-            <w:tcBorders>
-              <w:top w:val="none" w:color="FFFFFF" w:sz="0"/>
-              <w:left w:val="none" w:color="FFFFFF" w:sz="0"/>
-              <w:bottom w:val="single" w:color="9AA6C4" w:sz="6"/>
-              <w:right w:val="none" w:color="FFFFFF" w:sz="0"/>
-            </w:tcBorders>
-            <w:tcMar>
-              <w:top w:type="dxa" w:w="50"/>
-              <w:left w:type="dxa" w:w="100"/>
-              <w:bottom w:type="dxa" w:w="50"/>
-              <w:right w:type="dxa" w:w="100"/>
-            </w:tcMar>
-            <w:vAlign w:val="top"/>
-          </w:tcPr>
-          <w:p>
-            <w:pPr>
-              <w:spacing w:after="100" w:before="0"/>
-            </w:pPr>
-            <w:r>
-              <w:rPr>
-                <w:rFonts w:ascii="Calibri" w:cs="Calibri" w:eastAsia="Calibri" w:hAnsi="Calibri"/>
-                <w:color w:val="000000"/>
-                <w:sz w:val="22"/>
-                <w:szCs w:val="22"/>
-              </w:rPr>
-              <w:t xml:space="preserve"/>
-            </w:r>
-          </w:p>
-        </w:tc>
-      </w:tr>
-      <w:tr>
-        <w:trPr>
-          <w:cantSplit/>
-          <w:trHeight w:val="470" w:hRule="atLeast"/>
-        </w:trPr>
-        <w:tc>
-          <w:tcPr>
-            <w:tcW w:type="dxa" w:w="10206"/>
-            <w:tcBorders>
-              <w:top w:val="none" w:color="FFFFFF" w:sz="0"/>
-              <w:left w:val="none" w:color="FFFFFF" w:sz="0"/>
-              <w:bottom w:val="single" w:color="9AA6C4" w:sz="6"/>
-              <w:right w:val="none" w:color="FFFFFF" w:sz="0"/>
-            </w:tcBorders>
-            <w:tcMar>
-              <w:top w:type="dxa" w:w="50"/>
-              <w:left w:type="dxa" w:w="100"/>
-              <w:bottom w:type="dxa" w:w="50"/>
-              <w:right w:type="dxa" w:w="100"/>
-            </w:tcMar>
-            <w:vAlign w:val="top"/>
-          </w:tcPr>
-          <w:p>
-            <w:pPr>
-              <w:spacing w:after="100" w:before="0"/>
-            </w:pPr>
-            <w:r>
-              <w:rPr>
-                <w:rFonts w:ascii="Calibri" w:cs="Calibri" w:eastAsia="Calibri" w:hAnsi="Calibri"/>
-                <w:color w:val="000000"/>
-                <w:sz w:val="22"/>
-                <w:szCs w:val="22"/>
-              </w:rPr>
-              <w:t xml:space="preserve"/>
-            </w:r>
-          </w:p>
-        </w:tc>
-      </w:tr>
-      <w:tr>
-        <w:trPr>
-          <w:cantSplit/>
-          <w:trHeight w:val="470" w:hRule="atLeast"/>
-        </w:trPr>
-        <w:tc>
-          <w:tcPr>
-            <w:tcW w:type="dxa" w:w="10206"/>
-            <w:tcBorders>
-              <w:top w:val="none" w:color="FFFFFF" w:sz="0"/>
-              <w:left w:val="none" w:color="FFFFFF" w:sz="0"/>
-              <w:bottom w:val="single" w:color="9AA6C4" w:sz="6"/>
-              <w:right w:val="none" w:color="FFFFFF" w:sz="0"/>
-            </w:tcBorders>
-            <w:tcMar>
-              <w:top w:type="dxa" w:w="50"/>
-              <w:left w:type="dxa" w:w="100"/>
-              <w:bottom w:type="dxa" w:w="50"/>
-              <w:right w:type="dxa" w:w="100"/>
-            </w:tcMar>
-            <w:vAlign w:val="top"/>
-          </w:tcPr>
-          <w:p>
-            <w:pPr>
-              <w:spacing w:after="100" w:before="0"/>
-            </w:pPr>
-            <w:r>
-              <w:rPr>
-                <w:rFonts w:ascii="Calibri" w:cs="Calibri" w:eastAsia="Calibri" w:hAnsi="Calibri"/>
-                <w:color w:val="000000"/>
-                <w:sz w:val="22"/>
-                <w:szCs w:val="22"/>
-              </w:rPr>
-              <w:t xml:space="preserve"/>
-            </w:r>
-          </w:p>
-        </w:tc>
-      </w:tr>
-      <w:tr>
-        <w:trPr>
-          <w:cantSplit/>
-          <w:trHeight w:val="470" w:hRule="atLeast"/>
-        </w:trPr>
-        <w:tc>
-          <w:tcPr>
-            <w:tcW w:type="dxa" w:w="10206"/>
-            <w:tcBorders>
-              <w:top w:val="none" w:color="FFFFFF" w:sz="0"/>
-              <w:left w:val="none" w:color="FFFFFF" w:sz="0"/>
-              <w:bottom w:val="single" w:color="9AA6C4" w:sz="6"/>
-              <w:right w:val="none" w:color="FFFFFF" w:sz="0"/>
-            </w:tcBorders>
-            <w:tcMar>
-              <w:top w:type="dxa" w:w="50"/>
-              <w:left w:type="dxa" w:w="100"/>
-              <w:bottom w:type="dxa" w:w="50"/>
-              <w:right w:type="dxa" w:w="100"/>
-            </w:tcMar>
-            <w:vAlign w:val="top"/>
-          </w:tcPr>
-          <w:p>
-            <w:pPr>
-              <w:spacing w:after="100" w:before="0"/>
-            </w:pPr>
-            <w:r>
-              <w:rPr>
-                <w:rFonts w:ascii="Calibri" w:cs="Calibri" w:eastAsia="Calibri" w:hAnsi="Calibri"/>
-                <w:color w:val="000000"/>
-                <w:sz w:val="22"/>
-                <w:szCs w:val="22"/>
-              </w:rPr>
-              <w:t xml:space="preserve"/>
-            </w:r>
-          </w:p>
-        </w:tc>
-      </w:tr>
-      <w:tr>
-        <w:trPr>
-          <w:cantSplit/>
-          <w:trHeight w:val="470" w:hRule="atLeast"/>
-        </w:trPr>
-        <w:tc>
-          <w:tcPr>
-            <w:tcW w:type="dxa" w:w="10206"/>
-            <w:tcBorders>
-              <w:top w:val="none" w:color="FFFFFF" w:sz="0"/>
-              <w:left w:val="none" w:color="FFFFFF" w:sz="0"/>
-              <w:bottom w:val="single" w:color="9AA6C4" w:sz="6"/>
-              <w:right w:val="none" w:color="FFFFFF" w:sz="0"/>
-            </w:tcBorders>
-            <w:tcMar>
-              <w:top w:type="dxa" w:w="50"/>
-              <w:left w:type="dxa" w:w="100"/>
-              <w:bottom w:type="dxa" w:w="50"/>
-              <w:right w:type="dxa" w:w="100"/>
-            </w:tcMar>
-            <w:vAlign w:val="top"/>
-          </w:tcPr>
-          <w:p>
-            <w:pPr>
-              <w:spacing w:after="100" w:before="0"/>
-            </w:pPr>
-            <w:r>
-              <w:rPr>
-                <w:rFonts w:ascii="Calibri" w:cs="Calibri" w:eastAsia="Calibri" w:hAnsi="Calibri"/>
-                <w:color w:val="000000"/>
-                <w:sz w:val="22"/>
-                <w:szCs w:val="22"/>
-              </w:rPr>
-              <w:t xml:space="preserve"/>
-            </w:r>
-          </w:p>
-        </w:tc>
-      </w:tr>
-      <w:tr>
-        <w:trPr>
-          <w:cantSplit/>
-          <w:trHeight w:val="470" w:hRule="atLeast"/>
-        </w:trPr>
-        <w:tc>
-          <w:tcPr>
-            <w:tcW w:type="dxa" w:w="10206"/>
-            <w:tcBorders>
-              <w:top w:val="none" w:color="FFFFFF" w:sz="0"/>
-              <w:left w:val="none" w:color="FFFFFF" w:sz="0"/>
-              <w:bottom w:val="single" w:color="9AA6C4" w:sz="6"/>
-              <w:right w:val="none" w:color="FFFFFF" w:sz="0"/>
-            </w:tcBorders>
-            <w:tcMar>
-              <w:top w:type="dxa" w:w="50"/>
-              <w:left w:type="dxa" w:w="100"/>
-              <w:bottom w:type="dxa" w:w="50"/>
-              <w:right w:type="dxa" w:w="100"/>
-            </w:tcMar>
-            <w:vAlign w:val="top"/>
-          </w:tcPr>
-          <w:p>
-            <w:pPr>
-              <w:spacing w:after="100" w:before="0"/>
-            </w:pPr>
-            <w:r>
-              <w:rPr>
-                <w:rFonts w:ascii="Calibri" w:cs="Calibri" w:eastAsia="Calibri" w:hAnsi="Calibri"/>
-                <w:color w:val="000000"/>
-                <w:sz w:val="22"/>
-                <w:szCs w:val="22"/>
-              </w:rPr>
-              <w:t xml:space="preserve"/>
-            </w:r>
-          </w:p>
-        </w:tc>
-      </w:tr>
-      <w:tr>
-        <w:trPr>
-          <w:cantSplit/>
-          <w:trHeight w:val="470" w:hRule="atLeast"/>
-        </w:trPr>
-        <w:tc>
-          <w:tcPr>
-            <w:tcW w:type="dxa" w:w="10206"/>
-            <w:tcBorders>
-              <w:top w:val="none" w:color="FFFFFF" w:sz="0"/>
-              <w:left w:val="none" w:color="FFFFFF" w:sz="0"/>
-              <w:bottom w:val="single" w:color="9AA6C4" w:sz="6"/>
-              <w:right w:val="none" w:color="FFFFFF" w:sz="0"/>
-            </w:tcBorders>
-            <w:tcMar>
-              <w:top w:type="dxa" w:w="50"/>
-              <w:left w:type="dxa" w:w="100"/>
-              <w:bottom w:type="dxa" w:w="50"/>
-              <w:right w:type="dxa" w:w="100"/>
-            </w:tcMar>
-            <w:vAlign w:val="top"/>
-          </w:tcPr>
-          <w:p>
-            <w:pPr>
-              <w:spacing w:after="100" w:before="0"/>
-            </w:pPr>
-            <w:r>
-              <w:rPr>
-                <w:rFonts w:ascii="Calibri" w:cs="Calibri" w:eastAsia="Calibri" w:hAnsi="Calibri"/>
-                <w:color w:val="000000"/>
-                <w:sz w:val="22"/>
-                <w:szCs w:val="22"/>
-              </w:rPr>
-              <w:t xml:space="preserve"/>
-            </w:r>
-          </w:p>
-        </w:tc>
-      </w:tr>
-      <w:tr>
-        <w:trPr>
-          <w:cantSplit/>
-          <w:trHeight w:val="470" w:hRule="atLeast"/>
-        </w:trPr>
-        <w:tc>
-          <w:tcPr>
-            <w:tcW w:type="dxa" w:w="10206"/>
-            <w:tcBorders>
-              <w:top w:val="none" w:color="FFFFFF" w:sz="0"/>
-              <w:left w:val="none" w:color="FFFFFF" w:sz="0"/>
-              <w:bottom w:val="single" w:color="9AA6C4" w:sz="6"/>
-              <w:right w:val="none" w:color="FFFFFF" w:sz="0"/>
-            </w:tcBorders>
-            <w:tcMar>
-              <w:top w:type="dxa" w:w="50"/>
-              <w:left w:type="dxa" w:w="100"/>
-              <w:bottom w:type="dxa" w:w="50"/>
-              <w:right w:type="dxa" w:w="100"/>
-            </w:tcMar>
-            <w:vAlign w:val="top"/>
-          </w:tcPr>
-          <w:p>
-            <w:pPr>
-              <w:spacing w:after="100" w:before="0"/>
-            </w:pPr>
-            <w:r>
-              <w:rPr>
-                <w:rFonts w:ascii="Calibri" w:cs="Calibri" w:eastAsia="Calibri" w:hAnsi="Calibri"/>
-                <w:color w:val="000000"/>
-                <w:sz w:val="22"/>
-                <w:szCs w:val="22"/>
-              </w:rPr>
-              <w:t xml:space="preserve"/>
-            </w:r>
-          </w:p>
-        </w:tc>
-      </w:tr>
-      <w:tr>
-        <w:trPr>
-          <w:cantSplit/>
-          <w:trHeight w:val="470" w:hRule="atLeast"/>
-        </w:trPr>
-        <w:tc>
-          <w:tcPr>
-            <w:tcW w:type="dxa" w:w="10206"/>
-            <w:tcBorders>
-              <w:top w:val="none" w:color="FFFFFF" w:sz="0"/>
-              <w:left w:val="none" w:color="FFFFFF" w:sz="0"/>
-              <w:bottom w:val="single" w:color="9AA6C4" w:sz="6"/>
-              <w:right w:val="none" w:color="FFFFFF" w:sz="0"/>
-            </w:tcBorders>
-            <w:tcMar>
-              <w:top w:type="dxa" w:w="50"/>
-              <w:left w:type="dxa" w:w="100"/>
-              <w:bottom w:type="dxa" w:w="50"/>
-              <w:right w:type="dxa" w:w="100"/>
-            </w:tcMar>
-            <w:vAlign w:val="top"/>
-          </w:tcPr>
-          <w:p>
-            <w:pPr>
-              <w:spacing w:after="100" w:before="0"/>
-            </w:pPr>
-            <w:r>
-              <w:rPr>
-                <w:rFonts w:ascii="Calibri" w:cs="Calibri" w:eastAsia="Calibri" w:hAnsi="Calibri"/>
-                <w:color w:val="000000"/>
-                <w:sz w:val="22"/>
-                <w:szCs w:val="22"/>
-              </w:rPr>
-              <w:t xml:space="preserve"/>
-            </w:r>
-          </w:p>
-        </w:tc>
-      </w:tr>
-      <w:tr>
-        <w:trPr>
-          <w:cantSplit/>
-          <w:trHeight w:val="470" w:hRule="atLeast"/>
-        </w:trPr>
-        <w:tc>
-          <w:tcPr>
-            <w:tcW w:type="dxa" w:w="10206"/>
-            <w:tcBorders>
-              <w:top w:val="none" w:color="FFFFFF" w:sz="0"/>
-              <w:left w:val="none" w:color="FFFFFF" w:sz="0"/>
-              <w:bottom w:val="single" w:color="9AA6C4" w:sz="6"/>
-              <w:right w:val="none" w:color="FFFFFF" w:sz="0"/>
-            </w:tcBorders>
-            <w:tcMar>
-              <w:top w:type="dxa" w:w="50"/>
-              <w:left w:type="dxa" w:w="100"/>
-              <w:bottom w:type="dxa" w:w="50"/>
-              <w:right w:type="dxa" w:w="100"/>
-            </w:tcMar>
-            <w:vAlign w:val="top"/>
-          </w:tcPr>
-          <w:p>
-            <w:pPr>
-              <w:spacing w:after="100" w:before="0"/>
-            </w:pPr>
-            <w:r>
-              <w:rPr>
-                <w:rFonts w:ascii="Calibri" w:cs="Calibri" w:eastAsia="Calibri" w:hAnsi="Calibri"/>
-                <w:color w:val="000000"/>
-                <w:sz w:val="22"/>
-                <w:szCs w:val="22"/>
-              </w:rPr>
-              <w:t xml:space="preserve"/>
-            </w:r>
-          </w:p>
-        </w:tc>
-      </w:tr>
-      <w:tr>
-        <w:trPr>
-          <w:cantSplit/>
-          <w:trHeight w:val="470" w:hRule="atLeast"/>
-        </w:trPr>
-        <w:tc>
-          <w:tcPr>
-            <w:tcW w:type="dxa" w:w="10206"/>
-            <w:tcBorders>
-              <w:top w:val="none" w:color="FFFFFF" w:sz="0"/>
-              <w:left w:val="none" w:color="FFFFFF" w:sz="0"/>
-              <w:bottom w:val="single" w:color="9AA6C4" w:sz="6"/>
-              <w:right w:val="none" w:color="FFFFFF" w:sz="0"/>
-            </w:tcBorders>
-            <w:tcMar>
-              <w:top w:type="dxa" w:w="50"/>
-              <w:left w:type="dxa" w:w="100"/>
-              <w:bottom w:type="dxa" w:w="50"/>
-              <w:right w:type="dxa" w:w="100"/>
-            </w:tcMar>
-            <w:vAlign w:val="top"/>
-          </w:tcPr>
-          <w:p>
-            <w:pPr>
-              <w:spacing w:after="100" w:before="0"/>
-            </w:pPr>
-            <w:r>
-              <w:rPr>
-                <w:rFonts w:ascii="Calibri" w:cs="Calibri" w:eastAsia="Calibri" w:hAnsi="Calibri"/>
-                <w:color w:val="000000"/>
-                <w:sz w:val="22"/>
-                <w:szCs w:val="22"/>
-              </w:rPr>
-              <w:t xml:space="preserve"/>
-            </w:r>
-          </w:p>
-        </w:tc>
-      </w:tr>
-      <w:tr>
-        <w:trPr>
-          <w:cantSplit/>
-          <w:trHeight w:val="470" w:hRule="atLeast"/>
-        </w:trPr>
-        <w:tc>
-          <w:tcPr>
-            <w:tcW w:type="dxa" w:w="10206"/>
-            <w:tcBorders>
-              <w:top w:val="none" w:color="FFFFFF" w:sz="0"/>
-              <w:left w:val="none" w:color="FFFFFF" w:sz="0"/>
-              <w:bottom w:val="single" w:color="9AA6C4" w:sz="6"/>
-              <w:right w:val="none" w:color="FFFFFF" w:sz="0"/>
-            </w:tcBorders>
-            <w:tcMar>
-              <w:top w:type="dxa" w:w="50"/>
-              <w:left w:type="dxa" w:w="100"/>
-              <w:bottom w:type="dxa" w:w="50"/>
-              <w:right w:type="dxa" w:w="100"/>
-            </w:tcMar>
-            <w:vAlign w:val="top"/>
-          </w:tcPr>
-          <w:p>
-            <w:pPr>
-              <w:spacing w:after="100" w:before="0"/>
-            </w:pPr>
-            <w:r>
-              <w:rPr>
-                <w:rFonts w:ascii="Calibri" w:cs="Calibri" w:eastAsia="Calibri" w:hAnsi="Calibri"/>
-                <w:color w:val="000000"/>
-                <w:sz w:val="22"/>
-                <w:szCs w:val="22"/>
-              </w:rPr>
-              <w:t xml:space="preserve"/>
-            </w:r>
-          </w:p>
-        </w:tc>
-      </w:tr>
-      <w:tr>
-        <w:trPr>
-          <w:cantSplit/>
-          <w:trHeight w:val="470" w:hRule="atLeast"/>
-        </w:trPr>
-        <w:tc>
-          <w:tcPr>
-            <w:tcW w:type="dxa" w:w="10206"/>
-            <w:tcBorders>
-              <w:top w:val="none" w:color="FFFFFF" w:sz="0"/>
-              <w:left w:val="none" w:color="FFFFFF" w:sz="0"/>
-              <w:bottom w:val="single" w:color="9AA6C4" w:sz="6"/>
-              <w:right w:val="none" w:color="FFFFFF" w:sz="0"/>
-            </w:tcBorders>
-            <w:tcMar>
-              <w:top w:type="dxa" w:w="50"/>
-              <w:left w:type="dxa" w:w="100"/>
-              <w:bottom w:type="dxa" w:w="50"/>
-              <w:right w:type="dxa" w:w="100"/>
-            </w:tcMar>
-            <w:vAlign w:val="top"/>
-          </w:tcPr>
-          <w:p>
-            <w:pPr>
-              <w:spacing w:after="100" w:before="0"/>
-            </w:pPr>
-            <w:r>
-              <w:rPr>
-                <w:rFonts w:ascii="Calibri" w:cs="Calibri" w:eastAsia="Calibri" w:hAnsi="Calibri"/>
-                <w:color w:val="000000"/>
-                <w:sz w:val="22"/>
-                <w:szCs w:val="22"/>
-              </w:rPr>
-              <w:t xml:space="preserve"/>
-            </w:r>
-          </w:p>
-        </w:tc>
-      </w:tr>
-      <w:tr>
-        <w:trPr>
-          <w:cantSplit/>
-          <w:trHeight w:val="470" w:hRule="atLeast"/>
-        </w:trPr>
-        <w:tc>
-          <w:tcPr>
-            <w:tcW w:type="dxa" w:w="10206"/>
-            <w:tcBorders>
-              <w:top w:val="none" w:color="FFFFFF" w:sz="0"/>
-              <w:left w:val="none" w:color="FFFFFF" w:sz="0"/>
-              <w:bottom w:val="single" w:color="9AA6C4" w:sz="6"/>
-              <w:right w:val="none" w:color="FFFFFF" w:sz="0"/>
-            </w:tcBorders>
-            <w:tcMar>
-              <w:top w:type="dxa" w:w="50"/>
-              <w:left w:type="dxa" w:w="100"/>
-              <w:bottom w:type="dxa" w:w="50"/>
-              <w:right w:type="dxa" w:w="100"/>
-            </w:tcMar>
-            <w:vAlign w:val="top"/>
-          </w:tcPr>
-          <w:p>
-            <w:pPr>
-              <w:spacing w:after="100" w:before="0"/>
-            </w:pPr>
-            <w:r>
-              <w:rPr>
-                <w:rFonts w:ascii="Calibri" w:cs="Calibri" w:eastAsia="Calibri" w:hAnsi="Calibri"/>
-                <w:color w:val="000000"/>
-                <w:sz w:val="22"/>
-                <w:szCs w:val="22"/>
-              </w:rPr>
-              <w:t xml:space="preserve"/>
-            </w:r>
-          </w:p>
-        </w:tc>
-      </w:tr>
-      <w:tr>
-        <w:trPr>
-          <w:cantSplit/>
-          <w:trHeight w:val="470" w:hRule="atLeast"/>
-        </w:trPr>
-        <w:tc>
-          <w:tcPr>
-            <w:tcW w:type="dxa" w:w="10206"/>
-            <w:tcBorders>
-              <w:top w:val="none" w:color="FFFFFF" w:sz="0"/>
-              <w:left w:val="none" w:color="FFFFFF" w:sz="0"/>
-              <w:bottom w:val="single" w:color="9AA6C4" w:sz="6"/>
-              <w:right w:val="none" w:color="FFFFFF" w:sz="0"/>
-            </w:tcBorders>
-            <w:tcMar>
-              <w:top w:type="dxa" w:w="50"/>
-              <w:left w:type="dxa" w:w="100"/>
-              <w:bottom w:type="dxa" w:w="50"/>
-              <w:right w:type="dxa" w:w="100"/>
-            </w:tcMar>
-            <w:vAlign w:val="top"/>
-          </w:tcPr>
-          <w:p>
-            <w:pPr>
-              <w:spacing w:after="100" w:before="0"/>
-            </w:pPr>
-            <w:r>
-              <w:rPr>
-                <w:rFonts w:ascii="Calibri" w:cs="Calibri" w:eastAsia="Calibri" w:hAnsi="Calibri"/>
-                <w:color w:val="000000"/>
-                <w:sz w:val="22"/>
-                <w:szCs w:val="22"/>
-              </w:rPr>
-              <w:t xml:space="preserve"/>
-            </w:r>
-          </w:p>
-        </w:tc>
-      </w:tr>
-      <w:tr>
-        <w:trPr>
-          <w:cantSplit/>
-          <w:trHeight w:val="470" w:hRule="atLeast"/>
-        </w:trPr>
-        <w:tc>
-          <w:tcPr>
-            <w:tcW w:type="dxa" w:w="10206"/>
-            <w:tcBorders>
-              <w:top w:val="none" w:color="FFFFFF" w:sz="0"/>
-              <w:left w:val="none" w:color="FFFFFF" w:sz="0"/>
-              <w:bottom w:val="single" w:color="9AA6C4" w:sz="6"/>
-              <w:right w:val="none" w:color="FFFFFF" w:sz="0"/>
-            </w:tcBorders>
-            <w:tcMar>
-              <w:top w:type="dxa" w:w="50"/>
-              <w:left w:type="dxa" w:w="100"/>
-              <w:bottom w:type="dxa" w:w="50"/>
-              <w:right w:type="dxa" w:w="100"/>
-            </w:tcMar>
-            <w:vAlign w:val="top"/>
-          </w:tcPr>
-          <w:p>
-            <w:pPr>
-              <w:spacing w:after="100" w:before="0"/>
-            </w:pPr>
-            <w:r>
-              <w:rPr>
-                <w:rFonts w:ascii="Calibri" w:cs="Calibri" w:eastAsia="Calibri" w:hAnsi="Calibri"/>
-                <w:color w:val="000000"/>
-                <w:sz w:val="22"/>
-                <w:szCs w:val="22"/>
-              </w:rPr>
-              <w:t xml:space="preserve"/>
-            </w:r>
-          </w:p>
-        </w:tc>
-      </w:tr>
-      <w:tr>
-        <w:trPr>
-          <w:cantSplit/>
-          <w:trHeight w:val="470" w:hRule="atLeast"/>
-        </w:trPr>
-        <w:tc>
-          <w:tcPr>
-            <w:tcW w:type="dxa" w:w="10206"/>
-            <w:tcBorders>
-              <w:top w:val="none" w:color="FFFFFF" w:sz="0"/>
-              <w:left w:val="none" w:color="FFFFFF" w:sz="0"/>
-              <w:bottom w:val="single" w:color="9AA6C4" w:sz="6"/>
-              <w:right w:val="none" w:color="FFFFFF" w:sz="0"/>
-            </w:tcBorders>
-            <w:tcMar>
-              <w:top w:type="dxa" w:w="50"/>
-              <w:left w:type="dxa" w:w="100"/>
-              <w:bottom w:type="dxa" w:w="50"/>
-              <w:right w:type="dxa" w:w="100"/>
-            </w:tcMar>
-            <w:vAlign w:val="top"/>
-          </w:tcPr>
-          <w:p>
-            <w:pPr>
-              <w:spacing w:after="100" w:before="0"/>
-            </w:pPr>
-            <w:r>
-              <w:rPr>
-                <w:rFonts w:ascii="Calibri" w:cs="Calibri" w:eastAsia="Calibri" w:hAnsi="Calibri"/>
-                <w:color w:val="000000"/>
-                <w:sz w:val="22"/>
-                <w:szCs w:val="22"/>
-              </w:rPr>
-              <w:t xml:space="preserve"/>
-            </w:r>
-          </w:p>
-        </w:tc>
-      </w:tr>
-      <w:tr>
-        <w:trPr>
-          <w:cantSplit/>
-          <w:trHeight w:val="470" w:hRule="atLeast"/>
-        </w:trPr>
-        <w:tc>
-          <w:tcPr>
-            <w:tcW w:type="dxa" w:w="10206"/>
-            <w:tcBorders>
-              <w:top w:val="none" w:color="FFFFFF" w:sz="0"/>
-              <w:left w:val="none" w:color="FFFFFF" w:sz="0"/>
-              <w:bottom w:val="single" w:color="9AA6C4" w:sz="6"/>
-              <w:right w:val="none" w:color="FFFFFF" w:sz="0"/>
-            </w:tcBorders>
-            <w:tcMar>
-              <w:top w:type="dxa" w:w="50"/>
-              <w:left w:type="dxa" w:w="100"/>
-              <w:bottom w:type="dxa" w:w="50"/>
-              <w:right w:type="dxa" w:w="100"/>
-            </w:tcMar>
-            <w:vAlign w:val="top"/>
-          </w:tcPr>
-          <w:p>
-            <w:pPr>
-              <w:spacing w:after="100" w:before="0"/>
-            </w:pPr>
-            <w:r>
-              <w:rPr>
-                <w:rFonts w:ascii="Calibri" w:cs="Calibri" w:eastAsia="Calibri" w:hAnsi="Calibri"/>
-                <w:color w:val="000000"/>
-                <w:sz w:val="22"/>
-                <w:szCs w:val="22"/>
-              </w:rPr>
-              <w:t xml:space="preserve"/>
-            </w:r>
-          </w:p>
-        </w:tc>
-      </w:tr>
-      <w:tr>
-        <w:trPr>
-          <w:cantSplit/>
-          <w:trHeight w:val="470" w:hRule="atLeast"/>
-        </w:trPr>
-        <w:tc>
-          <w:tcPr>
-            <w:tcW w:type="dxa" w:w="10206"/>
-            <w:tcBorders>
-              <w:top w:val="none" w:color="FFFFFF" w:sz="0"/>
-              <w:left w:val="none" w:color="FFFFFF" w:sz="0"/>
-              <w:bottom w:val="single" w:color="9AA6C4" w:sz="6"/>
-              <w:right w:val="none" w:color="FFFFFF" w:sz="0"/>
-            </w:tcBorders>
-            <w:tcMar>
-              <w:top w:type="dxa" w:w="50"/>
-              <w:left w:type="dxa" w:w="100"/>
-              <w:bottom w:type="dxa" w:w="50"/>
-              <w:right w:type="dxa" w:w="100"/>
-            </w:tcMar>
-            <w:vAlign w:val="top"/>
-          </w:tcPr>
-          <w:p>
-            <w:pPr>
-              <w:spacing w:after="100" w:before="0"/>
-            </w:pPr>
-            <w:r>
-              <w:rPr>
-                <w:rFonts w:ascii="Calibri" w:cs="Calibri" w:eastAsia="Calibri" w:hAnsi="Calibri"/>
-                <w:color w:val="000000"/>
-                <w:sz w:val="22"/>
-                <w:szCs w:val="22"/>
-              </w:rPr>
-              <w:t xml:space="preserve"/>
             </w:r>
           </w:p>
         </w:tc>

</xml_diff>

<commit_message>
Kafka-Arbeitsblatt: Worterklärungen als hochgestellte Fußnoten
Co-Authored-By: Claude Opus 5.5 <noreply@anthropic.com>
Claude-Session: https://claude.ai/code/session_01Kzh1oWiqhC6W8oSNq8mKnj
</commit_message>
<xml_diff>
--- a/Deutsch_11/Kafka_Brief_an_den_Vater/Arbeitsblatt_Kafka_Brief_an_den_Vater.docx
+++ b/Deutsch_11/Kafka_Brief_an_den_Vater/Arbeitsblatt_Kafka_Brief_an_den_Vater.docx
@@ -237,7 +237,28 @@
                 <w:sz w:val="21"/>
                 <w:szCs w:val="21"/>
               </w:rPr>
-              <w:t xml:space="preserve">Die Unmöglichkeit des ruhigen Verkehrs hatte noch eine weitere eigentlich sehr</w:t>
+              <w:t xml:space="preserve">Die Unmöglichkeit des ruhigen Verkehrs</w:t>
+            </w:r>
+            <w:r>
+              <w:rPr>
+                <w:rFonts w:ascii="Calibri" w:cs="Calibri" w:eastAsia="Calibri" w:hAnsi="Calibri"/>
+                <w:b/>
+                <w:bCs/>
+                <w:color w:val="3F7CC4"/>
+                <w:sz w:val="21"/>
+                <w:szCs w:val="21"/>
+                <w:vertAlign w:val="superscript"/>
+              </w:rPr>
+              <w:t xml:space="preserve">1</w:t>
+            </w:r>
+            <w:r>
+              <w:rPr>
+                <w:rFonts w:ascii="Cambria" w:cs="Cambria" w:eastAsia="Cambria" w:hAnsi="Cambria"/>
+                <w:color w:val="000000"/>
+                <w:sz w:val="21"/>
+                <w:szCs w:val="21"/>
+              </w:rPr>
+              <w:t xml:space="preserve"> hatte noch eine weitere eigentlich sehr</w:t>
             </w:r>
           </w:p>
         </w:tc>
@@ -517,7 +538,28 @@
                 <w:sz w:val="21"/>
                 <w:szCs w:val="21"/>
               </w:rPr>
-              <w:t xml:space="preserve">Deine Drohung: »kein Wort der Widerrede!« und die dazu erhobene Hand begleiten</w:t>
+              <w:t xml:space="preserve">Deine Drohung: »kein Wort der Widerrede</w:t>
+            </w:r>
+            <w:r>
+              <w:rPr>
+                <w:rFonts w:ascii="Calibri" w:cs="Calibri" w:eastAsia="Calibri" w:hAnsi="Calibri"/>
+                <w:b/>
+                <w:bCs/>
+                <w:color w:val="3F7CC4"/>
+                <w:sz w:val="21"/>
+                <w:szCs w:val="21"/>
+                <w:vertAlign w:val="superscript"/>
+              </w:rPr>
+              <w:t xml:space="preserve">2</w:t>
+            </w:r>
+            <w:r>
+              <w:rPr>
+                <w:rFonts w:ascii="Cambria" w:cs="Cambria" w:eastAsia="Cambria" w:hAnsi="Cambria"/>
+                <w:color w:val="000000"/>
+                <w:sz w:val="21"/>
+                <w:szCs w:val="21"/>
+              </w:rPr>
+              <w:t xml:space="preserve">!« und die dazu erhobene Hand begleiten</w:t>
             </w:r>
           </w:p>
         </w:tc>
@@ -937,7 +979,28 @@
                 <w:sz w:val="21"/>
                 <w:szCs w:val="21"/>
               </w:rPr>
-              <w:t xml:space="preserve">unangenehmen Gegenkräfte in mir zum Schweigen bringen, diese Einwirkung war</w:t>
+              <w:t xml:space="preserve">unangenehmen Gegenkräfte</w:t>
+            </w:r>
+            <w:r>
+              <w:rPr>
+                <w:rFonts w:ascii="Calibri" w:cs="Calibri" w:eastAsia="Calibri" w:hAnsi="Calibri"/>
+                <w:b/>
+                <w:bCs/>
+                <w:color w:val="3F7CC4"/>
+                <w:sz w:val="21"/>
+                <w:szCs w:val="21"/>
+                <w:vertAlign w:val="superscript"/>
+              </w:rPr>
+              <w:t xml:space="preserve">3</w:t>
+            </w:r>
+            <w:r>
+              <w:rPr>
+                <w:rFonts w:ascii="Cambria" w:cs="Cambria" w:eastAsia="Cambria" w:hAnsi="Cambria"/>
+                <w:color w:val="000000"/>
+                <w:sz w:val="21"/>
+                <w:szCs w:val="21"/>
+              </w:rPr>
+              <w:t xml:space="preserve"> in mir zum Schweigen bringen, diese Einwirkung war</w:t>
             </w:r>
           </w:p>
         </w:tc>
@@ -1217,7 +1280,28 @@
                 <w:sz w:val="21"/>
                 <w:szCs w:val="21"/>
               </w:rPr>
-              <w:t xml:space="preserve">standst davor, und alles schien Dir wieder »contra« zu sein, während es nur</w:t>
+              <w:t xml:space="preserve">standst davor, und alles schien Dir wieder »contra</w:t>
+            </w:r>
+            <w:r>
+              <w:rPr>
+                <w:rFonts w:ascii="Calibri" w:cs="Calibri" w:eastAsia="Calibri" w:hAnsi="Calibri"/>
+                <w:b/>
+                <w:bCs/>
+                <w:color w:val="3F7CC4"/>
+                <w:sz w:val="21"/>
+                <w:szCs w:val="21"/>
+                <w:vertAlign w:val="superscript"/>
+              </w:rPr>
+              <w:t xml:space="preserve">4</w:t>
+            </w:r>
+            <w:r>
+              <w:rPr>
+                <w:rFonts w:ascii="Cambria" w:cs="Cambria" w:eastAsia="Cambria" w:hAnsi="Cambria"/>
+                <w:color w:val="000000"/>
+                <w:sz w:val="21"/>
+                <w:szCs w:val="21"/>
+              </w:rPr>
+              <w:t xml:space="preserve">« zu sein, während es nur</w:t>
             </w:r>
           </w:p>
         </w:tc>
@@ -1307,9 +1391,9 @@
               <w:right w:val="none" w:color="FFFFFF" w:sz="0"/>
             </w:tcBorders>
             <w:tcMar>
-              <w:top w:type="dxa" w:w="60"/>
-              <w:left w:type="dxa" w:w="140"/>
-              <w:bottom w:type="dxa" w:w="60"/>
+              <w:top w:type="dxa" w:w="50"/>
+              <w:left w:type="dxa" w:w="140"/>
+              <w:bottom w:type="dxa" w:w="50"/>
               <w:right w:type="dxa" w:w="140"/>
             </w:tcMar>
             <w:vAlign w:val="top"/>
@@ -1326,17 +1410,9 @@
                 <w:color w:val="3F7CC4"/>
                 <w:sz w:val="17"/>
                 <w:szCs w:val="17"/>
-              </w:rPr>
-              <w:t xml:space="preserve">Verkehr </w:t>
-            </w:r>
-            <w:r>
-              <w:rPr>
-                <w:rFonts w:ascii="Calibri" w:cs="Calibri" w:eastAsia="Calibri" w:hAnsi="Calibri"/>
-                <w:color w:val="5B6B8C"/>
-                <w:sz w:val="17"/>
-                <w:szCs w:val="17"/>
-              </w:rPr>
-              <w:t xml:space="preserve">= Umgang miteinander</w:t>
+                <w:vertAlign w:val="superscript"/>
+              </w:rPr>
+              <w:t xml:space="preserve">1</w:t>
             </w:r>
             <w:r>
               <w:rPr>
@@ -1347,7 +1423,7 @@
                 <w:sz w:val="17"/>
                 <w:szCs w:val="17"/>
               </w:rPr>
-              <w:t xml:space="preserve">   ·   Widerrede </w:t>
+              <w:t xml:space="preserve"> Verkehr </w:t>
             </w:r>
             <w:r>
               <w:rPr>
@@ -1356,8 +1432,37 @@
                 <w:sz w:val="17"/>
                 <w:szCs w:val="17"/>
               </w:rPr>
-              <w:t xml:space="preserve">= Widerspruch</w:t>
-            </w:r>
+              <w:t xml:space="preserve">= Umgang miteinander</w:t>
+            </w:r>
+          </w:p>
+        </w:tc>
+      </w:tr>
+      <w:tr>
+        <w:trPr>
+          <w:cantSplit/>
+        </w:trPr>
+        <w:tc>
+          <w:tcPr>
+            <w:tcW w:type="dxa" w:w="10206"/>
+            <w:gridSpan w:val="2"/>
+            <w:tcBorders>
+              <w:top w:val="none" w:color="FFFFFF" w:sz="0"/>
+              <w:left w:val="none" w:color="FFFFFF" w:sz="0"/>
+              <w:bottom w:val="none" w:color="FFFFFF" w:sz="0"/>
+              <w:right w:val="none" w:color="FFFFFF" w:sz="0"/>
+            </w:tcBorders>
+            <w:tcMar>
+              <w:top w:type="dxa" w:w="0"/>
+              <w:left w:type="dxa" w:w="140"/>
+              <w:bottom w:type="dxa" w:w="0"/>
+              <w:right w:type="dxa" w:w="140"/>
+            </w:tcMar>
+            <w:vAlign w:val="top"/>
+          </w:tcPr>
+          <w:p>
+            <w:pPr>
+              <w:spacing w:after="0" w:before="0"/>
+            </w:pPr>
             <w:r>
               <w:rPr>
                 <w:rFonts w:ascii="Calibri" w:cs="Calibri" w:eastAsia="Calibri" w:hAnsi="Calibri"/>
@@ -1366,17 +1471,9 @@
                 <w:color w:val="3F7CC4"/>
                 <w:sz w:val="17"/>
                 <w:szCs w:val="17"/>
-              </w:rPr>
-              <w:t xml:space="preserve">   ·   Gegenkräfte </w:t>
-            </w:r>
-            <w:r>
-              <w:rPr>
-                <w:rFonts w:ascii="Calibri" w:cs="Calibri" w:eastAsia="Calibri" w:hAnsi="Calibri"/>
-                <w:color w:val="5B6B8C"/>
-                <w:sz w:val="17"/>
-                <w:szCs w:val="17"/>
-              </w:rPr>
-              <w:t xml:space="preserve">= eigener Wille, Widerstand</w:t>
+                <w:vertAlign w:val="superscript"/>
+              </w:rPr>
+              <w:t xml:space="preserve">2</w:t>
             </w:r>
             <w:r>
               <w:rPr>
@@ -1387,7 +1484,7 @@
                 <w:sz w:val="17"/>
                 <w:szCs w:val="17"/>
               </w:rPr>
-              <w:t xml:space="preserve">   ·   contra </w:t>
+              <w:t xml:space="preserve"> Widerrede </w:t>
             </w:r>
             <w:r>
               <w:rPr>
@@ -1396,8 +1493,37 @@
                 <w:sz w:val="17"/>
                 <w:szCs w:val="17"/>
               </w:rPr>
-              <w:t xml:space="preserve">= dagegen</w:t>
-            </w:r>
+              <w:t xml:space="preserve">= Widerspruch</w:t>
+            </w:r>
+          </w:p>
+        </w:tc>
+      </w:tr>
+      <w:tr>
+        <w:trPr>
+          <w:cantSplit/>
+        </w:trPr>
+        <w:tc>
+          <w:tcPr>
+            <w:tcW w:type="dxa" w:w="10206"/>
+            <w:gridSpan w:val="2"/>
+            <w:tcBorders>
+              <w:top w:val="none" w:color="FFFFFF" w:sz="0"/>
+              <w:left w:val="none" w:color="FFFFFF" w:sz="0"/>
+              <w:bottom w:val="none" w:color="FFFFFF" w:sz="0"/>
+              <w:right w:val="none" w:color="FFFFFF" w:sz="0"/>
+            </w:tcBorders>
+            <w:tcMar>
+              <w:top w:type="dxa" w:w="0"/>
+              <w:left w:type="dxa" w:w="140"/>
+              <w:bottom w:type="dxa" w:w="0"/>
+              <w:right w:type="dxa" w:w="140"/>
+            </w:tcMar>
+            <w:vAlign w:val="top"/>
+          </w:tcPr>
+          <w:p>
+            <w:pPr>
+              <w:spacing w:after="0" w:before="0"/>
+            </w:pPr>
             <w:r>
               <w:rPr>
                 <w:rFonts w:ascii="Calibri" w:cs="Calibri" w:eastAsia="Calibri" w:hAnsi="Calibri"/>
@@ -1406,8 +1532,139 @@
                 <w:color w:val="3F7CC4"/>
                 <w:sz w:val="17"/>
                 <w:szCs w:val="17"/>
-              </w:rPr>
-              <w:t xml:space="preserve">   ·   […] </w:t>
+                <w:vertAlign w:val="superscript"/>
+              </w:rPr>
+              <w:t xml:space="preserve">3</w:t>
+            </w:r>
+            <w:r>
+              <w:rPr>
+                <w:rFonts w:ascii="Calibri" w:cs="Calibri" w:eastAsia="Calibri" w:hAnsi="Calibri"/>
+                <w:b/>
+                <w:bCs/>
+                <w:color w:val="3F7CC4"/>
+                <w:sz w:val="17"/>
+                <w:szCs w:val="17"/>
+              </w:rPr>
+              <w:t xml:space="preserve"> Gegenkräfte </w:t>
+            </w:r>
+            <w:r>
+              <w:rPr>
+                <w:rFonts w:ascii="Calibri" w:cs="Calibri" w:eastAsia="Calibri" w:hAnsi="Calibri"/>
+                <w:color w:val="5B6B8C"/>
+                <w:sz w:val="17"/>
+                <w:szCs w:val="17"/>
+              </w:rPr>
+              <w:t xml:space="preserve">= eigener Wille, Widerstand</w:t>
+            </w:r>
+          </w:p>
+        </w:tc>
+      </w:tr>
+      <w:tr>
+        <w:trPr>
+          <w:cantSplit/>
+        </w:trPr>
+        <w:tc>
+          <w:tcPr>
+            <w:tcW w:type="dxa" w:w="10206"/>
+            <w:gridSpan w:val="2"/>
+            <w:tcBorders>
+              <w:top w:val="none" w:color="FFFFFF" w:sz="0"/>
+              <w:left w:val="none" w:color="FFFFFF" w:sz="0"/>
+              <w:bottom w:val="none" w:color="FFFFFF" w:sz="0"/>
+              <w:right w:val="none" w:color="FFFFFF" w:sz="0"/>
+            </w:tcBorders>
+            <w:tcMar>
+              <w:top w:type="dxa" w:w="0"/>
+              <w:left w:type="dxa" w:w="140"/>
+              <w:bottom w:type="dxa" w:w="0"/>
+              <w:right w:type="dxa" w:w="140"/>
+            </w:tcMar>
+            <w:vAlign w:val="top"/>
+          </w:tcPr>
+          <w:p>
+            <w:pPr>
+              <w:spacing w:after="0" w:before="0"/>
+            </w:pPr>
+            <w:r>
+              <w:rPr>
+                <w:rFonts w:ascii="Calibri" w:cs="Calibri" w:eastAsia="Calibri" w:hAnsi="Calibri"/>
+                <w:b/>
+                <w:bCs/>
+                <w:color w:val="3F7CC4"/>
+                <w:sz w:val="17"/>
+                <w:szCs w:val="17"/>
+                <w:vertAlign w:val="superscript"/>
+              </w:rPr>
+              <w:t xml:space="preserve">4</w:t>
+            </w:r>
+            <w:r>
+              <w:rPr>
+                <w:rFonts w:ascii="Calibri" w:cs="Calibri" w:eastAsia="Calibri" w:hAnsi="Calibri"/>
+                <w:b/>
+                <w:bCs/>
+                <w:color w:val="3F7CC4"/>
+                <w:sz w:val="17"/>
+                <w:szCs w:val="17"/>
+              </w:rPr>
+              <w:t xml:space="preserve"> contra </w:t>
+            </w:r>
+            <w:r>
+              <w:rPr>
+                <w:rFonts w:ascii="Calibri" w:cs="Calibri" w:eastAsia="Calibri" w:hAnsi="Calibri"/>
+                <w:color w:val="5B6B8C"/>
+                <w:sz w:val="17"/>
+                <w:szCs w:val="17"/>
+              </w:rPr>
+              <w:t xml:space="preserve">= dagegen</w:t>
+            </w:r>
+          </w:p>
+        </w:tc>
+      </w:tr>
+      <w:tr>
+        <w:trPr>
+          <w:cantSplit/>
+        </w:trPr>
+        <w:tc>
+          <w:tcPr>
+            <w:tcW w:type="dxa" w:w="10206"/>
+            <w:gridSpan w:val="2"/>
+            <w:tcBorders>
+              <w:top w:val="none" w:color="FFFFFF" w:sz="0"/>
+              <w:left w:val="none" w:color="FFFFFF" w:sz="0"/>
+              <w:bottom w:val="none" w:color="FFFFFF" w:sz="0"/>
+              <w:right w:val="none" w:color="FFFFFF" w:sz="0"/>
+            </w:tcBorders>
+            <w:tcMar>
+              <w:top w:type="dxa" w:w="0"/>
+              <w:left w:type="dxa" w:w="140"/>
+              <w:bottom w:type="dxa" w:w="0"/>
+              <w:right w:type="dxa" w:w="140"/>
+            </w:tcMar>
+            <w:vAlign w:val="top"/>
+          </w:tcPr>
+          <w:p>
+            <w:pPr>
+              <w:spacing w:after="0" w:before="0"/>
+            </w:pPr>
+            <w:r>
+              <w:rPr>
+                <w:rFonts w:ascii="Calibri" w:cs="Calibri" w:eastAsia="Calibri" w:hAnsi="Calibri"/>
+                <w:color w:val="000000"/>
+                <w:sz w:val="17"/>
+                <w:szCs w:val="17"/>
+              </w:rPr>
+              <w:t xml:space="preserve"/>
+            </w:r>
+            <w:r>
+              <w:rPr>
+                <w:rFonts w:ascii="Calibri" w:cs="Calibri" w:eastAsia="Calibri" w:hAnsi="Calibri"/>
+                <w:b/>
+                <w:bCs/>
+                <w:color w:val="3F7CC4"/>
+                <w:sz w:val="17"/>
+                <w:szCs w:val="17"/>
+              </w:rPr>
+              <w:t xml:space="preserve">[…] </w:t>
             </w:r>
             <w:r>
               <w:rPr>
@@ -1626,7 +1883,28 @@
                 <w:sz w:val="21"/>
                 <w:szCs w:val="21"/>
               </w:rPr>
-              <w:t xml:space="preserve">auch am besten Deiner Überlegenheit über mich. Eine Ermahnung hatte bei Dir</w:t>
+              <w:t xml:space="preserve">auch am besten Deiner Überlegenheit über mich. Eine Ermahnung</w:t>
+            </w:r>
+            <w:r>
+              <w:rPr>
+                <w:rFonts w:ascii="Calibri" w:cs="Calibri" w:eastAsia="Calibri" w:hAnsi="Calibri"/>
+                <w:b/>
+                <w:bCs/>
+                <w:color w:val="D9534F"/>
+                <w:sz w:val="21"/>
+                <w:szCs w:val="21"/>
+                <w:vertAlign w:val="superscript"/>
+              </w:rPr>
+              <w:t xml:space="preserve">5</w:t>
+            </w:r>
+            <w:r>
+              <w:rPr>
+                <w:rFonts w:ascii="Cambria" w:cs="Cambria" w:eastAsia="Cambria" w:hAnsi="Cambria"/>
+                <w:color w:val="000000"/>
+                <w:sz w:val="21"/>
+                <w:szCs w:val="21"/>
+              </w:rPr>
+              <w:t xml:space="preserve"> hatte bei Dir</w:t>
             </w:r>
           </w:p>
         </w:tc>
@@ -1906,7 +2184,28 @@
                 <w:sz w:val="21"/>
                 <w:szCs w:val="21"/>
               </w:rPr>
-              <w:t xml:space="preserve">gewissermaßen schon bestraft, ehe man noch wußte, daß man etwas Schlechtes</w:t>
+              <w:t xml:space="preserve">gewissermaßen</w:t>
+            </w:r>
+            <w:r>
+              <w:rPr>
+                <w:rFonts w:ascii="Calibri" w:cs="Calibri" w:eastAsia="Calibri" w:hAnsi="Calibri"/>
+                <w:b/>
+                <w:bCs/>
+                <w:color w:val="D9534F"/>
+                <w:sz w:val="21"/>
+                <w:szCs w:val="21"/>
+                <w:vertAlign w:val="superscript"/>
+              </w:rPr>
+              <w:t xml:space="preserve">6</w:t>
+            </w:r>
+            <w:r>
+              <w:rPr>
+                <w:rFonts w:ascii="Cambria" w:cs="Cambria" w:eastAsia="Cambria" w:hAnsi="Cambria"/>
+                <w:color w:val="000000"/>
+                <w:sz w:val="21"/>
+                <w:szCs w:val="21"/>
+              </w:rPr>
+              <w:t xml:space="preserve"> schon bestraft, ehe man noch wußte, daß man etwas Schlechtes</w:t>
             </w:r>
           </w:p>
         </w:tc>
@@ -2046,7 +2345,28 @@
                 <w:sz w:val="21"/>
                 <w:szCs w:val="21"/>
               </w:rPr>
-              <w:t xml:space="preserve">Person behandelt, also nicht einmal des bösen Ansprechens gewürdigt wurde; wo</w:t>
+              <w:t xml:space="preserve">Person behandelt, also nicht einmal des bösen Ansprechens gewürdigt</w:t>
+            </w:r>
+            <w:r>
+              <w:rPr>
+                <w:rFonts w:ascii="Calibri" w:cs="Calibri" w:eastAsia="Calibri" w:hAnsi="Calibri"/>
+                <w:b/>
+                <w:bCs/>
+                <w:color w:val="D9534F"/>
+                <w:sz w:val="21"/>
+                <w:szCs w:val="21"/>
+                <w:vertAlign w:val="superscript"/>
+              </w:rPr>
+              <w:t xml:space="preserve">7</w:t>
+            </w:r>
+            <w:r>
+              <w:rPr>
+                <w:rFonts w:ascii="Cambria" w:cs="Cambria" w:eastAsia="Cambria" w:hAnsi="Cambria"/>
+                <w:color w:val="000000"/>
+                <w:sz w:val="21"/>
+                <w:szCs w:val="21"/>
+              </w:rPr>
+              <w:t xml:space="preserve"> wurde; wo</w:t>
             </w:r>
           </w:p>
         </w:tc>
@@ -2116,7 +2436,28 @@
                 <w:sz w:val="21"/>
                 <w:szCs w:val="21"/>
               </w:rPr>
-              <w:t xml:space="preserve">Du also etwa formell zur Mutter sprachst, aber eigentlich zu mir, der dabei</w:t>
+              <w:t xml:space="preserve">Du also etwa formell</w:t>
+            </w:r>
+            <w:r>
+              <w:rPr>
+                <w:rFonts w:ascii="Calibri" w:cs="Calibri" w:eastAsia="Calibri" w:hAnsi="Calibri"/>
+                <w:b/>
+                <w:bCs/>
+                <w:color w:val="D9534F"/>
+                <w:sz w:val="21"/>
+                <w:szCs w:val="21"/>
+                <w:vertAlign w:val="superscript"/>
+              </w:rPr>
+              <w:t xml:space="preserve">8</w:t>
+            </w:r>
+            <w:r>
+              <w:rPr>
+                <w:rFonts w:ascii="Cambria" w:cs="Cambria" w:eastAsia="Cambria" w:hAnsi="Cambria"/>
+                <w:color w:val="000000"/>
+                <w:sz w:val="21"/>
+                <w:szCs w:val="21"/>
+              </w:rPr>
+              <w:t xml:space="preserve"> zur Mutter sprachst, aber eigentlich zu mir, der dabei</w:t>
             </w:r>
           </w:p>
         </w:tc>
@@ -2256,7 +2597,28 @@
                 <w:sz w:val="21"/>
                 <w:szCs w:val="21"/>
               </w:rPr>
-              <w:t xml:space="preserve">dergleichen. (Das bekam dann sein Gegenspiel darin, daß ich zum Beispiel nicht</w:t>
+              <w:t xml:space="preserve">dergleichen. (Das bekam dann sein Gegenspiel</w:t>
+            </w:r>
+            <w:r>
+              <w:rPr>
+                <w:rFonts w:ascii="Calibri" w:cs="Calibri" w:eastAsia="Calibri" w:hAnsi="Calibri"/>
+                <w:b/>
+                <w:bCs/>
+                <w:color w:val="D9534F"/>
+                <w:sz w:val="21"/>
+                <w:szCs w:val="21"/>
+                <w:vertAlign w:val="superscript"/>
+              </w:rPr>
+              <w:t xml:space="preserve">9</w:t>
+            </w:r>
+            <w:r>
+              <w:rPr>
+                <w:rFonts w:ascii="Cambria" w:cs="Cambria" w:eastAsia="Cambria" w:hAnsi="Cambria"/>
+                <w:color w:val="000000"/>
+                <w:sz w:val="21"/>
+                <w:szCs w:val="21"/>
+              </w:rPr>
+              <w:t xml:space="preserve"> darin, daß ich zum Beispiel nicht</w:t>
             </w:r>
           </w:p>
         </w:tc>
@@ -2556,9 +2918,9 @@
               <w:right w:val="none" w:color="FFFFFF" w:sz="0"/>
             </w:tcBorders>
             <w:tcMar>
-              <w:top w:type="dxa" w:w="60"/>
-              <w:left w:type="dxa" w:w="140"/>
-              <w:bottom w:type="dxa" w:w="60"/>
+              <w:top w:type="dxa" w:w="50"/>
+              <w:left w:type="dxa" w:w="140"/>
+              <w:bottom w:type="dxa" w:w="50"/>
               <w:right w:type="dxa" w:w="140"/>
             </w:tcMar>
             <w:vAlign w:val="top"/>
@@ -2575,17 +2937,9 @@
                 <w:color w:val="D9534F"/>
                 <w:sz w:val="17"/>
                 <w:szCs w:val="17"/>
-              </w:rPr>
-              <w:t xml:space="preserve">Ermahnung </w:t>
-            </w:r>
-            <w:r>
-              <w:rPr>
-                <w:rFonts w:ascii="Calibri" w:cs="Calibri" w:eastAsia="Calibri" w:hAnsi="Calibri"/>
-                <w:color w:val="5B6B8C"/>
-                <w:sz w:val="17"/>
-                <w:szCs w:val="17"/>
-              </w:rPr>
-              <w:t xml:space="preserve">= Zurechtweisung</w:t>
+                <w:vertAlign w:val="superscript"/>
+              </w:rPr>
+              <w:t xml:space="preserve">5</w:t>
             </w:r>
             <w:r>
               <w:rPr>
@@ -2596,7 +2950,7 @@
                 <w:sz w:val="17"/>
                 <w:szCs w:val="17"/>
               </w:rPr>
-              <w:t xml:space="preserve">   ·   gewissermaßen </w:t>
+              <w:t xml:space="preserve"> Ermahnung </w:t>
             </w:r>
             <w:r>
               <w:rPr>
@@ -2605,8 +2959,37 @@
                 <w:sz w:val="17"/>
                 <w:szCs w:val="17"/>
               </w:rPr>
-              <w:t xml:space="preserve">= sozusagen</w:t>
-            </w:r>
+              <w:t xml:space="preserve">= Zurechtweisung</w:t>
+            </w:r>
+          </w:p>
+        </w:tc>
+      </w:tr>
+      <w:tr>
+        <w:trPr>
+          <w:cantSplit/>
+        </w:trPr>
+        <w:tc>
+          <w:tcPr>
+            <w:tcW w:type="dxa" w:w="10206"/>
+            <w:gridSpan w:val="2"/>
+            <w:tcBorders>
+              <w:top w:val="none" w:color="FFFFFF" w:sz="0"/>
+              <w:left w:val="none" w:color="FFFFFF" w:sz="0"/>
+              <w:bottom w:val="none" w:color="FFFFFF" w:sz="0"/>
+              <w:right w:val="none" w:color="FFFFFF" w:sz="0"/>
+            </w:tcBorders>
+            <w:tcMar>
+              <w:top w:type="dxa" w:w="0"/>
+              <w:left w:type="dxa" w:w="140"/>
+              <w:bottom w:type="dxa" w:w="0"/>
+              <w:right w:type="dxa" w:w="140"/>
+            </w:tcMar>
+            <w:vAlign w:val="top"/>
+          </w:tcPr>
+          <w:p>
+            <w:pPr>
+              <w:spacing w:after="0" w:before="0"/>
+            </w:pPr>
             <w:r>
               <w:rPr>
                 <w:rFonts w:ascii="Calibri" w:cs="Calibri" w:eastAsia="Calibri" w:hAnsi="Calibri"/>
@@ -2615,17 +2998,9 @@
                 <w:color w:val="D9534F"/>
                 <w:sz w:val="17"/>
                 <w:szCs w:val="17"/>
-              </w:rPr>
-              <w:t xml:space="preserve">   ·   formell </w:t>
-            </w:r>
-            <w:r>
-              <w:rPr>
-                <w:rFonts w:ascii="Calibri" w:cs="Calibri" w:eastAsia="Calibri" w:hAnsi="Calibri"/>
-                <w:color w:val="5B6B8C"/>
-                <w:sz w:val="17"/>
-                <w:szCs w:val="17"/>
-              </w:rPr>
-              <w:t xml:space="preserve">= der Form nach</w:t>
+                <w:vertAlign w:val="superscript"/>
+              </w:rPr>
+              <w:t xml:space="preserve">6</w:t>
             </w:r>
             <w:r>
               <w:rPr>
@@ -2636,7 +3011,7 @@
                 <w:sz w:val="17"/>
                 <w:szCs w:val="17"/>
               </w:rPr>
-              <w:t xml:space="preserve">   ·   gewürdigt </w:t>
+              <w:t xml:space="preserve"> gewissermaßen </w:t>
             </w:r>
             <w:r>
               <w:rPr>
@@ -2645,8 +3020,37 @@
                 <w:sz w:val="17"/>
                 <w:szCs w:val="17"/>
               </w:rPr>
-              <w:t xml:space="preserve">= für wert befunden</w:t>
-            </w:r>
+              <w:t xml:space="preserve">= sozusagen</w:t>
+            </w:r>
+          </w:p>
+        </w:tc>
+      </w:tr>
+      <w:tr>
+        <w:trPr>
+          <w:cantSplit/>
+        </w:trPr>
+        <w:tc>
+          <w:tcPr>
+            <w:tcW w:type="dxa" w:w="10206"/>
+            <w:gridSpan w:val="2"/>
+            <w:tcBorders>
+              <w:top w:val="none" w:color="FFFFFF" w:sz="0"/>
+              <w:left w:val="none" w:color="FFFFFF" w:sz="0"/>
+              <w:bottom w:val="none" w:color="FFFFFF" w:sz="0"/>
+              <w:right w:val="none" w:color="FFFFFF" w:sz="0"/>
+            </w:tcBorders>
+            <w:tcMar>
+              <w:top w:type="dxa" w:w="0"/>
+              <w:left w:type="dxa" w:w="140"/>
+              <w:bottom w:type="dxa" w:w="0"/>
+              <w:right w:type="dxa" w:w="140"/>
+            </w:tcMar>
+            <w:vAlign w:val="top"/>
+          </w:tcPr>
+          <w:p>
+            <w:pPr>
+              <w:spacing w:after="0" w:before="0"/>
+            </w:pPr>
             <w:r>
               <w:rPr>
                 <w:rFonts w:ascii="Calibri" w:cs="Calibri" w:eastAsia="Calibri" w:hAnsi="Calibri"/>
@@ -2655,8 +3059,142 @@
                 <w:color w:val="D9534F"/>
                 <w:sz w:val="17"/>
                 <w:szCs w:val="17"/>
-              </w:rPr>
-              <w:t xml:space="preserve">   ·   Gegenspiel </w:t>
+                <w:vertAlign w:val="superscript"/>
+              </w:rPr>
+              <w:t xml:space="preserve">7</w:t>
+            </w:r>
+            <w:r>
+              <w:rPr>
+                <w:rFonts w:ascii="Calibri" w:cs="Calibri" w:eastAsia="Calibri" w:hAnsi="Calibri"/>
+                <w:b/>
+                <w:bCs/>
+                <w:color w:val="D9534F"/>
+                <w:sz w:val="17"/>
+                <w:szCs w:val="17"/>
+              </w:rPr>
+              <w:t xml:space="preserve"> gewürdigt </w:t>
+            </w:r>
+            <w:r>
+              <w:rPr>
+                <w:rFonts w:ascii="Calibri" w:cs="Calibri" w:eastAsia="Calibri" w:hAnsi="Calibri"/>
+                <w:color w:val="5B6B8C"/>
+                <w:sz w:val="17"/>
+                <w:szCs w:val="17"/>
+              </w:rPr>
+              <w:t xml:space="preserve">= für wert befunden</w:t>
+            </w:r>
+          </w:p>
+        </w:tc>
+      </w:tr>
+      <w:tr>
+        <w:trPr>
+          <w:cantSplit/>
+        </w:trPr>
+        <w:tc>
+          <w:tcPr>
+            <w:tcW w:type="dxa" w:w="10206"/>
+            <w:gridSpan w:val="2"/>
+            <w:tcBorders>
+              <w:top w:val="none" w:color="FFFFFF" w:sz="0"/>
+              <w:left w:val="none" w:color="FFFFFF" w:sz="0"/>
+              <w:bottom w:val="none" w:color="FFFFFF" w:sz="0"/>
+              <w:right w:val="none" w:color="FFFFFF" w:sz="0"/>
+            </w:tcBorders>
+            <w:tcMar>
+              <w:top w:type="dxa" w:w="0"/>
+              <w:left w:type="dxa" w:w="140"/>
+              <w:bottom w:type="dxa" w:w="0"/>
+              <w:right w:type="dxa" w:w="140"/>
+            </w:tcMar>
+            <w:vAlign w:val="top"/>
+          </w:tcPr>
+          <w:p>
+            <w:pPr>
+              <w:spacing w:after="0" w:before="0"/>
+            </w:pPr>
+            <w:r>
+              <w:rPr>
+                <w:rFonts w:ascii="Calibri" w:cs="Calibri" w:eastAsia="Calibri" w:hAnsi="Calibri"/>
+                <w:b/>
+                <w:bCs/>
+                <w:color w:val="D9534F"/>
+                <w:sz w:val="17"/>
+                <w:szCs w:val="17"/>
+                <w:vertAlign w:val="superscript"/>
+              </w:rPr>
+              <w:t xml:space="preserve">8</w:t>
+            </w:r>
+            <w:r>
+              <w:rPr>
+                <w:rFonts w:ascii="Calibri" w:cs="Calibri" w:eastAsia="Calibri" w:hAnsi="Calibri"/>
+                <w:b/>
+                <w:bCs/>
+                <w:color w:val="D9534F"/>
+                <w:sz w:val="17"/>
+                <w:szCs w:val="17"/>
+              </w:rPr>
+              <w:t xml:space="preserve"> formell </w:t>
+            </w:r>
+            <w:r>
+              <w:rPr>
+                <w:rFonts w:ascii="Calibri" w:cs="Calibri" w:eastAsia="Calibri" w:hAnsi="Calibri"/>
+                <w:color w:val="5B6B8C"/>
+                <w:sz w:val="17"/>
+                <w:szCs w:val="17"/>
+              </w:rPr>
+              <w:t xml:space="preserve">= der Form nach</w:t>
+            </w:r>
+          </w:p>
+        </w:tc>
+      </w:tr>
+      <w:tr>
+        <w:trPr>
+          <w:cantSplit/>
+        </w:trPr>
+        <w:tc>
+          <w:tcPr>
+            <w:tcW w:type="dxa" w:w="10206"/>
+            <w:gridSpan w:val="2"/>
+            <w:tcBorders>
+              <w:top w:val="none" w:color="FFFFFF" w:sz="0"/>
+              <w:left w:val="none" w:color="FFFFFF" w:sz="0"/>
+              <w:bottom w:val="none" w:color="FFFFFF" w:sz="0"/>
+              <w:right w:val="none" w:color="FFFFFF" w:sz="0"/>
+            </w:tcBorders>
+            <w:tcMar>
+              <w:top w:type="dxa" w:w="0"/>
+              <w:left w:type="dxa" w:w="140"/>
+              <w:bottom w:type="dxa" w:w="0"/>
+              <w:right w:type="dxa" w:w="140"/>
+            </w:tcMar>
+            <w:vAlign w:val="top"/>
+          </w:tcPr>
+          <w:p>
+            <w:pPr>
+              <w:spacing w:after="0" w:before="0"/>
+            </w:pPr>
+            <w:r>
+              <w:rPr>
+                <w:rFonts w:ascii="Calibri" w:cs="Calibri" w:eastAsia="Calibri" w:hAnsi="Calibri"/>
+                <w:b/>
+                <w:bCs/>
+                <w:color w:val="D9534F"/>
+                <w:sz w:val="17"/>
+                <w:szCs w:val="17"/>
+                <w:vertAlign w:val="superscript"/>
+              </w:rPr>
+              <w:t xml:space="preserve">9</w:t>
+            </w:r>
+            <w:r>
+              <w:rPr>
+                <w:rFonts w:ascii="Calibri" w:cs="Calibri" w:eastAsia="Calibri" w:hAnsi="Calibri"/>
+                <w:b/>
+                <w:bCs/>
+                <w:color w:val="D9534F"/>
+                <w:sz w:val="17"/>
+                <w:szCs w:val="17"/>
+              </w:rPr>
+              <w:t xml:space="preserve"> Gegenspiel </w:t>
             </w:r>
             <w:r>
               <w:rPr>

</xml_diff>